<commit_message>
docs(entrega-4): URL de Logística publicada, diagrama de componentes del grupo y motivo de Donaciones
- URL pública de Logística en Render (https://donatrack-logistica-0op2.onrender.com)
  en el informe, el respaldo técnico, el ADR de despliegue y las figuras de
  despliegue. Verificada: 200 en /v3/api-docs; arranque en frío de más de 60 s.
- Diagrama de componentes (entregable 4) reemplazado por la imagen del grupo;
  se quita la fuente PlantUML anterior y se actualizan sus referencias.
- Ficha de Donaciones: el motivo de diferir la persistencia relacional es que
  no era requisito de la entrega (confirmado por el subgrupo).

Co-Authored-By: Claude Opus 5.5 <noreply@anthropic.com>
</commit_message>
<xml_diff>
--- a/docs/entrega-4/arquitectura/entregable-5/arquitectura-sistema-e4.docx
+++ b/docs/entrega-4/arquitectura/entregable-5/arquitectura-sistema-e4.docx
@@ -532,7 +532,7 @@
       <w:r>
         <w:fldChar w:fldCharType="separate"/>
       </w:r>
-      <w:hyperlink w:anchor="_Toc242440594" w:history="1">
+      <w:hyperlink w:anchor="_Toc242473760" w:history="1">
         <w:r>
           <w:rPr>
             <w:rStyle w:val="Hyperlink"/>
@@ -559,7 +559,7 @@
             <w:noProof/>
             <w:webHidden/>
           </w:rPr>
-          <w:instrText xml:space="preserve"> PAGEREF _Toc242440594 \h </w:instrText>
+          <w:instrText xml:space="preserve"> PAGEREF _Toc242473760 \h </w:instrText>
         </w:r>
         <w:r>
           <w:rPr>
@@ -607,7 +607,7 @@
           <w14:ligatures w14:val="standardContextual"/>
         </w:rPr>
       </w:pPr>
-      <w:hyperlink w:anchor="_Toc242440595" w:history="1">
+      <w:hyperlink w:anchor="_Toc242473761" w:history="1">
         <w:r>
           <w:rPr>
             <w:rStyle w:val="Hyperlink"/>
@@ -634,7 +634,7 @@
             <w:noProof/>
             <w:webHidden/>
           </w:rPr>
-          <w:instrText xml:space="preserve"> PAGEREF _Toc242440595 \h </w:instrText>
+          <w:instrText xml:space="preserve"> PAGEREF _Toc242473761 \h </w:instrText>
         </w:r>
         <w:r>
           <w:rPr>
@@ -682,7 +682,7 @@
           <w14:ligatures w14:val="standardContextual"/>
         </w:rPr>
       </w:pPr>
-      <w:hyperlink w:anchor="_Toc242440596" w:history="1">
+      <w:hyperlink w:anchor="_Toc242473762" w:history="1">
         <w:r>
           <w:rPr>
             <w:rStyle w:val="Hyperlink"/>
@@ -709,7 +709,7 @@
             <w:noProof/>
             <w:webHidden/>
           </w:rPr>
-          <w:instrText xml:space="preserve"> PAGEREF _Toc242440596 \h </w:instrText>
+          <w:instrText xml:space="preserve"> PAGEREF _Toc242473762 \h </w:instrText>
         </w:r>
         <w:r>
           <w:rPr>
@@ -757,7 +757,7 @@
           <w14:ligatures w14:val="standardContextual"/>
         </w:rPr>
       </w:pPr>
-      <w:hyperlink w:anchor="_Toc242440597" w:history="1">
+      <w:hyperlink w:anchor="_Toc242473763" w:history="1">
         <w:r>
           <w:rPr>
             <w:rStyle w:val="Hyperlink"/>
@@ -784,7 +784,7 @@
             <w:noProof/>
             <w:webHidden/>
           </w:rPr>
-          <w:instrText xml:space="preserve"> PAGEREF _Toc242440597 \h </w:instrText>
+          <w:instrText xml:space="preserve"> PAGEREF _Toc242473763 \h </w:instrText>
         </w:r>
         <w:r>
           <w:rPr>
@@ -832,7 +832,7 @@
           <w14:ligatures w14:val="standardContextual"/>
         </w:rPr>
       </w:pPr>
-      <w:hyperlink w:anchor="_Toc242440598" w:history="1">
+      <w:hyperlink w:anchor="_Toc242473764" w:history="1">
         <w:r>
           <w:rPr>
             <w:rStyle w:val="Hyperlink"/>
@@ -859,7 +859,7 @@
             <w:noProof/>
             <w:webHidden/>
           </w:rPr>
-          <w:instrText xml:space="preserve"> PAGEREF _Toc242440598 \h </w:instrText>
+          <w:instrText xml:space="preserve"> PAGEREF _Toc242473764 \h </w:instrText>
         </w:r>
         <w:r>
           <w:rPr>
@@ -907,7 +907,7 @@
           <w14:ligatures w14:val="standardContextual"/>
         </w:rPr>
       </w:pPr>
-      <w:hyperlink w:anchor="_Toc242440599" w:history="1">
+      <w:hyperlink w:anchor="_Toc242473765" w:history="1">
         <w:r>
           <w:rPr>
             <w:rStyle w:val="Hyperlink"/>
@@ -934,7 +934,7 @@
             <w:noProof/>
             <w:webHidden/>
           </w:rPr>
-          <w:instrText xml:space="preserve"> PAGEREF _Toc242440599 \h </w:instrText>
+          <w:instrText xml:space="preserve"> PAGEREF _Toc242473765 \h </w:instrText>
         </w:r>
         <w:r>
           <w:rPr>
@@ -982,7 +982,7 @@
           <w14:ligatures w14:val="standardContextual"/>
         </w:rPr>
       </w:pPr>
-      <w:hyperlink w:anchor="_Toc242440600" w:history="1">
+      <w:hyperlink w:anchor="_Toc242473766" w:history="1">
         <w:r>
           <w:rPr>
             <w:rStyle w:val="Hyperlink"/>
@@ -1009,7 +1009,7 @@
             <w:noProof/>
             <w:webHidden/>
           </w:rPr>
-          <w:instrText xml:space="preserve"> PAGEREF _Toc242440600 \h </w:instrText>
+          <w:instrText xml:space="preserve"> PAGEREF _Toc242473766 \h </w:instrText>
         </w:r>
         <w:r>
           <w:rPr>
@@ -1057,7 +1057,7 @@
           <w14:ligatures w14:val="standardContextual"/>
         </w:rPr>
       </w:pPr>
-      <w:hyperlink w:anchor="_Toc242440601" w:history="1">
+      <w:hyperlink w:anchor="_Toc242473767" w:history="1">
         <w:r>
           <w:rPr>
             <w:rStyle w:val="Hyperlink"/>
@@ -1084,7 +1084,7 @@
             <w:noProof/>
             <w:webHidden/>
           </w:rPr>
-          <w:instrText xml:space="preserve"> PAGEREF _Toc242440601 \h </w:instrText>
+          <w:instrText xml:space="preserve"> PAGEREF _Toc242473767 \h </w:instrText>
         </w:r>
         <w:r>
           <w:rPr>
@@ -1132,7 +1132,7 @@
           <w14:ligatures w14:val="standardContextual"/>
         </w:rPr>
       </w:pPr>
-      <w:hyperlink w:anchor="_Toc242440602" w:history="1">
+      <w:hyperlink w:anchor="_Toc242473768" w:history="1">
         <w:r>
           <w:rPr>
             <w:rStyle w:val="Hyperlink"/>
@@ -1159,7 +1159,7 @@
             <w:noProof/>
             <w:webHidden/>
           </w:rPr>
-          <w:instrText xml:space="preserve"> PAGEREF _Toc242440602 \h </w:instrText>
+          <w:instrText xml:space="preserve"> PAGEREF _Toc242473768 \h </w:instrText>
         </w:r>
         <w:r>
           <w:rPr>
@@ -1207,7 +1207,7 @@
           <w14:ligatures w14:val="standardContextual"/>
         </w:rPr>
       </w:pPr>
-      <w:hyperlink w:anchor="_Toc242440603" w:history="1">
+      <w:hyperlink w:anchor="_Toc242473769" w:history="1">
         <w:r>
           <w:rPr>
             <w:rStyle w:val="Hyperlink"/>
@@ -1234,7 +1234,7 @@
             <w:noProof/>
             <w:webHidden/>
           </w:rPr>
-          <w:instrText xml:space="preserve"> PAGEREF _Toc242440603 \h </w:instrText>
+          <w:instrText xml:space="preserve"> PAGEREF _Toc242473769 \h </w:instrText>
         </w:r>
         <w:r>
           <w:rPr>
@@ -1282,7 +1282,7 @@
           <w14:ligatures w14:val="standardContextual"/>
         </w:rPr>
       </w:pPr>
-      <w:hyperlink w:anchor="_Toc242440604" w:history="1">
+      <w:hyperlink w:anchor="_Toc242473770" w:history="1">
         <w:r>
           <w:rPr>
             <w:rStyle w:val="Hyperlink"/>
@@ -1309,7 +1309,7 @@
             <w:noProof/>
             <w:webHidden/>
           </w:rPr>
-          <w:instrText xml:space="preserve"> PAGEREF _Toc242440604 \h </w:instrText>
+          <w:instrText xml:space="preserve"> PAGEREF _Toc242473770 \h </w:instrText>
         </w:r>
         <w:r>
           <w:rPr>
@@ -1357,7 +1357,7 @@
           <w14:ligatures w14:val="standardContextual"/>
         </w:rPr>
       </w:pPr>
-      <w:hyperlink w:anchor="_Toc242440605" w:history="1">
+      <w:hyperlink w:anchor="_Toc242473771" w:history="1">
         <w:r>
           <w:rPr>
             <w:rStyle w:val="Hyperlink"/>
@@ -1384,7 +1384,7 @@
             <w:noProof/>
             <w:webHidden/>
           </w:rPr>
-          <w:instrText xml:space="preserve"> PAGEREF _Toc242440605 \h </w:instrText>
+          <w:instrText xml:space="preserve"> PAGEREF _Toc242473771 \h </w:instrText>
         </w:r>
         <w:r>
           <w:rPr>
@@ -1432,7 +1432,7 @@
           <w14:ligatures w14:val="standardContextual"/>
         </w:rPr>
       </w:pPr>
-      <w:hyperlink w:anchor="_Toc242440606" w:history="1">
+      <w:hyperlink w:anchor="_Toc242473772" w:history="1">
         <w:r>
           <w:rPr>
             <w:rStyle w:val="Hyperlink"/>
@@ -1459,7 +1459,7 @@
             <w:noProof/>
             <w:webHidden/>
           </w:rPr>
-          <w:instrText xml:space="preserve"> PAGEREF _Toc242440606 \h </w:instrText>
+          <w:instrText xml:space="preserve"> PAGEREF _Toc242473772 \h </w:instrText>
         </w:r>
         <w:r>
           <w:rPr>
@@ -1507,7 +1507,7 @@
           <w14:ligatures w14:val="standardContextual"/>
         </w:rPr>
       </w:pPr>
-      <w:hyperlink w:anchor="_Toc242440607" w:history="1">
+      <w:hyperlink w:anchor="_Toc242473773" w:history="1">
         <w:r>
           <w:rPr>
             <w:rStyle w:val="Hyperlink"/>
@@ -1534,7 +1534,7 @@
             <w:noProof/>
             <w:webHidden/>
           </w:rPr>
-          <w:instrText xml:space="preserve"> PAGEREF _Toc242440607 \h </w:instrText>
+          <w:instrText xml:space="preserve"> PAGEREF _Toc242473773 \h </w:instrText>
         </w:r>
         <w:r>
           <w:rPr>
@@ -1582,7 +1582,7 @@
           <w14:ligatures w14:val="standardContextual"/>
         </w:rPr>
       </w:pPr>
-      <w:hyperlink w:anchor="_Toc242440608" w:history="1">
+      <w:hyperlink w:anchor="_Toc242473774" w:history="1">
         <w:r>
           <w:rPr>
             <w:rStyle w:val="Hyperlink"/>
@@ -1609,7 +1609,7 @@
             <w:noProof/>
             <w:webHidden/>
           </w:rPr>
-          <w:instrText xml:space="preserve"> PAGEREF _Toc242440608 \h </w:instrText>
+          <w:instrText xml:space="preserve"> PAGEREF _Toc242473774 \h </w:instrText>
         </w:r>
         <w:r>
           <w:rPr>
@@ -1657,7 +1657,7 @@
           <w14:ligatures w14:val="standardContextual"/>
         </w:rPr>
       </w:pPr>
-      <w:hyperlink w:anchor="_Toc242440609" w:history="1">
+      <w:hyperlink w:anchor="_Toc242473775" w:history="1">
         <w:r>
           <w:rPr>
             <w:rStyle w:val="Hyperlink"/>
@@ -1684,7 +1684,7 @@
             <w:noProof/>
             <w:webHidden/>
           </w:rPr>
-          <w:instrText xml:space="preserve"> PAGEREF _Toc242440609 \h </w:instrText>
+          <w:instrText xml:space="preserve"> PAGEREF _Toc242473775 \h </w:instrText>
         </w:r>
         <w:r>
           <w:rPr>
@@ -1732,7 +1732,7 @@
           <w14:ligatures w14:val="standardContextual"/>
         </w:rPr>
       </w:pPr>
-      <w:hyperlink w:anchor="_Toc242440610" w:history="1">
+      <w:hyperlink w:anchor="_Toc242473776" w:history="1">
         <w:r>
           <w:rPr>
             <w:rStyle w:val="Hyperlink"/>
@@ -1759,7 +1759,7 @@
             <w:noProof/>
             <w:webHidden/>
           </w:rPr>
-          <w:instrText xml:space="preserve"> PAGEREF _Toc242440610 \h </w:instrText>
+          <w:instrText xml:space="preserve"> PAGEREF _Toc242473776 \h </w:instrText>
         </w:r>
         <w:r>
           <w:rPr>
@@ -1807,7 +1807,7 @@
           <w14:ligatures w14:val="standardContextual"/>
         </w:rPr>
       </w:pPr>
-      <w:hyperlink w:anchor="_Toc242440611" w:history="1">
+      <w:hyperlink w:anchor="_Toc242473777" w:history="1">
         <w:r>
           <w:rPr>
             <w:rStyle w:val="Hyperlink"/>
@@ -1834,7 +1834,7 @@
             <w:noProof/>
             <w:webHidden/>
           </w:rPr>
-          <w:instrText xml:space="preserve"> PAGEREF _Toc242440611 \h </w:instrText>
+          <w:instrText xml:space="preserve"> PAGEREF _Toc242473777 \h </w:instrText>
         </w:r>
         <w:r>
           <w:rPr>
@@ -1882,7 +1882,7 @@
           <w14:ligatures w14:val="standardContextual"/>
         </w:rPr>
       </w:pPr>
-      <w:hyperlink w:anchor="_Toc242440612" w:history="1">
+      <w:hyperlink w:anchor="_Toc242473778" w:history="1">
         <w:r>
           <w:rPr>
             <w:rStyle w:val="Hyperlink"/>
@@ -1909,7 +1909,7 @@
             <w:noProof/>
             <w:webHidden/>
           </w:rPr>
-          <w:instrText xml:space="preserve"> PAGEREF _Toc242440612 \h </w:instrText>
+          <w:instrText xml:space="preserve"> PAGEREF _Toc242473778 \h </w:instrText>
         </w:r>
         <w:r>
           <w:rPr>
@@ -1957,7 +1957,7 @@
           <w14:ligatures w14:val="standardContextual"/>
         </w:rPr>
       </w:pPr>
-      <w:hyperlink w:anchor="_Toc242440613" w:history="1">
+      <w:hyperlink w:anchor="_Toc242473779" w:history="1">
         <w:r>
           <w:rPr>
             <w:rStyle w:val="Hyperlink"/>
@@ -1984,7 +1984,7 @@
             <w:noProof/>
             <w:webHidden/>
           </w:rPr>
-          <w:instrText xml:space="preserve"> PAGEREF _Toc242440613 \h </w:instrText>
+          <w:instrText xml:space="preserve"> PAGEREF _Toc242473779 \h </w:instrText>
         </w:r>
         <w:r>
           <w:rPr>
@@ -2032,7 +2032,7 @@
           <w14:ligatures w14:val="standardContextual"/>
         </w:rPr>
       </w:pPr>
-      <w:hyperlink w:anchor="_Toc242440614" w:history="1">
+      <w:hyperlink w:anchor="_Toc242473780" w:history="1">
         <w:r>
           <w:rPr>
             <w:rStyle w:val="Hyperlink"/>
@@ -2059,7 +2059,7 @@
             <w:noProof/>
             <w:webHidden/>
           </w:rPr>
-          <w:instrText xml:space="preserve"> PAGEREF _Toc242440614 \h </w:instrText>
+          <w:instrText xml:space="preserve"> PAGEREF _Toc242473780 \h </w:instrText>
         </w:r>
         <w:r>
           <w:rPr>
@@ -2107,7 +2107,7 @@
           <w14:ligatures w14:val="standardContextual"/>
         </w:rPr>
       </w:pPr>
-      <w:hyperlink w:anchor="_Toc242440615" w:history="1">
+      <w:hyperlink w:anchor="_Toc242473781" w:history="1">
         <w:r>
           <w:rPr>
             <w:rStyle w:val="Hyperlink"/>
@@ -2134,7 +2134,7 @@
             <w:noProof/>
             <w:webHidden/>
           </w:rPr>
-          <w:instrText xml:space="preserve"> PAGEREF _Toc242440615 \h </w:instrText>
+          <w:instrText xml:space="preserve"> PAGEREF _Toc242473781 \h </w:instrText>
         </w:r>
         <w:r>
           <w:rPr>
@@ -2182,7 +2182,7 @@
           <w14:ligatures w14:val="standardContextual"/>
         </w:rPr>
       </w:pPr>
-      <w:hyperlink w:anchor="_Toc242440616" w:history="1">
+      <w:hyperlink w:anchor="_Toc242473782" w:history="1">
         <w:r>
           <w:rPr>
             <w:rStyle w:val="Hyperlink"/>
@@ -2209,7 +2209,7 @@
             <w:noProof/>
             <w:webHidden/>
           </w:rPr>
-          <w:instrText xml:space="preserve"> PAGEREF _Toc242440616 \h </w:instrText>
+          <w:instrText xml:space="preserve"> PAGEREF _Toc242473782 \h </w:instrText>
         </w:r>
         <w:r>
           <w:rPr>
@@ -2257,7 +2257,7 @@
           <w14:ligatures w14:val="standardContextual"/>
         </w:rPr>
       </w:pPr>
-      <w:hyperlink w:anchor="_Toc242440617" w:history="1">
+      <w:hyperlink w:anchor="_Toc242473783" w:history="1">
         <w:r>
           <w:rPr>
             <w:rStyle w:val="Hyperlink"/>
@@ -2284,7 +2284,7 @@
             <w:noProof/>
             <w:webHidden/>
           </w:rPr>
-          <w:instrText xml:space="preserve"> PAGEREF _Toc242440617 \h </w:instrText>
+          <w:instrText xml:space="preserve"> PAGEREF _Toc242473783 \h </w:instrText>
         </w:r>
         <w:r>
           <w:rPr>
@@ -2332,7 +2332,7 @@
           <w14:ligatures w14:val="standardContextual"/>
         </w:rPr>
       </w:pPr>
-      <w:hyperlink w:anchor="_Toc242440618" w:history="1">
+      <w:hyperlink w:anchor="_Toc242473784" w:history="1">
         <w:r>
           <w:rPr>
             <w:rStyle w:val="Hyperlink"/>
@@ -2359,7 +2359,7 @@
             <w:noProof/>
             <w:webHidden/>
           </w:rPr>
-          <w:instrText xml:space="preserve"> PAGEREF _Toc242440618 \h </w:instrText>
+          <w:instrText xml:space="preserve"> PAGEREF _Toc242473784 \h </w:instrText>
         </w:r>
         <w:r>
           <w:rPr>
@@ -2407,7 +2407,7 @@
           <w14:ligatures w14:val="standardContextual"/>
         </w:rPr>
       </w:pPr>
-      <w:hyperlink w:anchor="_Toc242440619" w:history="1">
+      <w:hyperlink w:anchor="_Toc242473785" w:history="1">
         <w:r>
           <w:rPr>
             <w:rStyle w:val="Hyperlink"/>
@@ -2434,7 +2434,7 @@
             <w:noProof/>
             <w:webHidden/>
           </w:rPr>
-          <w:instrText xml:space="preserve"> PAGEREF _Toc242440619 \h </w:instrText>
+          <w:instrText xml:space="preserve"> PAGEREF _Toc242473785 \h </w:instrText>
         </w:r>
         <w:r>
           <w:rPr>
@@ -2482,7 +2482,7 @@
           <w14:ligatures w14:val="standardContextual"/>
         </w:rPr>
       </w:pPr>
-      <w:hyperlink w:anchor="_Toc242440620" w:history="1">
+      <w:hyperlink w:anchor="_Toc242473786" w:history="1">
         <w:r>
           <w:rPr>
             <w:rStyle w:val="Hyperlink"/>
@@ -2509,7 +2509,7 @@
             <w:noProof/>
             <w:webHidden/>
           </w:rPr>
-          <w:instrText xml:space="preserve"> PAGEREF _Toc242440620 \h </w:instrText>
+          <w:instrText xml:space="preserve"> PAGEREF _Toc242473786 \h </w:instrText>
         </w:r>
         <w:r>
           <w:rPr>
@@ -2557,7 +2557,7 @@
           <w14:ligatures w14:val="standardContextual"/>
         </w:rPr>
       </w:pPr>
-      <w:hyperlink w:anchor="_Toc242440621" w:history="1">
+      <w:hyperlink w:anchor="_Toc242473787" w:history="1">
         <w:r>
           <w:rPr>
             <w:rStyle w:val="Hyperlink"/>
@@ -2584,7 +2584,7 @@
             <w:noProof/>
             <w:webHidden/>
           </w:rPr>
-          <w:instrText xml:space="preserve"> PAGEREF _Toc242440621 \h </w:instrText>
+          <w:instrText xml:space="preserve"> PAGEREF _Toc242473787 \h </w:instrText>
         </w:r>
         <w:r>
           <w:rPr>
@@ -2632,7 +2632,7 @@
           <w14:ligatures w14:val="standardContextual"/>
         </w:rPr>
       </w:pPr>
-      <w:hyperlink w:anchor="_Toc242440622" w:history="1">
+      <w:hyperlink w:anchor="_Toc242473788" w:history="1">
         <w:r>
           <w:rPr>
             <w:rStyle w:val="Hyperlink"/>
@@ -2659,7 +2659,7 @@
             <w:noProof/>
             <w:webHidden/>
           </w:rPr>
-          <w:instrText xml:space="preserve"> PAGEREF _Toc242440622 \h </w:instrText>
+          <w:instrText xml:space="preserve"> PAGEREF _Toc242473788 \h </w:instrText>
         </w:r>
         <w:r>
           <w:rPr>
@@ -2707,7 +2707,7 @@
           <w14:ligatures w14:val="standardContextual"/>
         </w:rPr>
       </w:pPr>
-      <w:hyperlink w:anchor="_Toc242440623" w:history="1">
+      <w:hyperlink w:anchor="_Toc242473789" w:history="1">
         <w:r>
           <w:rPr>
             <w:rStyle w:val="Hyperlink"/>
@@ -2734,7 +2734,7 @@
             <w:noProof/>
             <w:webHidden/>
           </w:rPr>
-          <w:instrText xml:space="preserve"> PAGEREF _Toc242440623 \h </w:instrText>
+          <w:instrText xml:space="preserve"> PAGEREF _Toc242473789 \h </w:instrText>
         </w:r>
         <w:r>
           <w:rPr>
@@ -2782,7 +2782,7 @@
           <w14:ligatures w14:val="standardContextual"/>
         </w:rPr>
       </w:pPr>
-      <w:hyperlink w:anchor="_Toc242440624" w:history="1">
+      <w:hyperlink w:anchor="_Toc242473790" w:history="1">
         <w:r>
           <w:rPr>
             <w:rStyle w:val="Hyperlink"/>
@@ -2809,7 +2809,7 @@
             <w:noProof/>
             <w:webHidden/>
           </w:rPr>
-          <w:instrText xml:space="preserve"> PAGEREF _Toc242440624 \h </w:instrText>
+          <w:instrText xml:space="preserve"> PAGEREF _Toc242473790 \h </w:instrText>
         </w:r>
         <w:r>
           <w:rPr>
@@ -2857,7 +2857,7 @@
           <w14:ligatures w14:val="standardContextual"/>
         </w:rPr>
       </w:pPr>
-      <w:hyperlink w:anchor="_Toc242440625" w:history="1">
+      <w:hyperlink w:anchor="_Toc242473791" w:history="1">
         <w:r>
           <w:rPr>
             <w:rStyle w:val="Hyperlink"/>
@@ -2884,7 +2884,7 @@
             <w:noProof/>
             <w:webHidden/>
           </w:rPr>
-          <w:instrText xml:space="preserve"> PAGEREF _Toc242440625 \h </w:instrText>
+          <w:instrText xml:space="preserve"> PAGEREF _Toc242473791 \h </w:instrText>
         </w:r>
         <w:r>
           <w:rPr>
@@ -2932,7 +2932,7 @@
           <w14:ligatures w14:val="standardContextual"/>
         </w:rPr>
       </w:pPr>
-      <w:hyperlink w:anchor="_Toc242440626" w:history="1">
+      <w:hyperlink w:anchor="_Toc242473792" w:history="1">
         <w:r>
           <w:rPr>
             <w:rStyle w:val="Hyperlink"/>
@@ -2959,7 +2959,7 @@
             <w:noProof/>
             <w:webHidden/>
           </w:rPr>
-          <w:instrText xml:space="preserve"> PAGEREF _Toc242440626 \h </w:instrText>
+          <w:instrText xml:space="preserve"> PAGEREF _Toc242473792 \h </w:instrText>
         </w:r>
         <w:r>
           <w:rPr>
@@ -3007,7 +3007,7 @@
           <w14:ligatures w14:val="standardContextual"/>
         </w:rPr>
       </w:pPr>
-      <w:hyperlink w:anchor="_Toc242440627" w:history="1">
+      <w:hyperlink w:anchor="_Toc242473793" w:history="1">
         <w:r>
           <w:rPr>
             <w:rStyle w:val="Hyperlink"/>
@@ -3034,7 +3034,7 @@
             <w:noProof/>
             <w:webHidden/>
           </w:rPr>
-          <w:instrText xml:space="preserve"> PAGEREF _Toc242440627 \h </w:instrText>
+          <w:instrText xml:space="preserve"> PAGEREF _Toc242473793 \h </w:instrText>
         </w:r>
         <w:r>
           <w:rPr>
@@ -3082,7 +3082,7 @@
           <w14:ligatures w14:val="standardContextual"/>
         </w:rPr>
       </w:pPr>
-      <w:hyperlink w:anchor="_Toc242440628" w:history="1">
+      <w:hyperlink w:anchor="_Toc242473794" w:history="1">
         <w:r>
           <w:rPr>
             <w:rStyle w:val="Hyperlink"/>
@@ -3109,7 +3109,7 @@
             <w:noProof/>
             <w:webHidden/>
           </w:rPr>
-          <w:instrText xml:space="preserve"> PAGEREF _Toc242440628 \h </w:instrText>
+          <w:instrText xml:space="preserve"> PAGEREF _Toc242473794 \h </w:instrText>
         </w:r>
         <w:r>
           <w:rPr>
@@ -3157,7 +3157,7 @@
           <w14:ligatures w14:val="standardContextual"/>
         </w:rPr>
       </w:pPr>
-      <w:hyperlink w:anchor="_Toc242440629" w:history="1">
+      <w:hyperlink w:anchor="_Toc242473795" w:history="1">
         <w:r>
           <w:rPr>
             <w:rStyle w:val="Hyperlink"/>
@@ -3184,7 +3184,7 @@
             <w:noProof/>
             <w:webHidden/>
           </w:rPr>
-          <w:instrText xml:space="preserve"> PAGEREF _Toc242440629 \h </w:instrText>
+          <w:instrText xml:space="preserve"> PAGEREF _Toc242473795 \h </w:instrText>
         </w:r>
         <w:r>
           <w:rPr>
@@ -3232,7 +3232,7 @@
           <w14:ligatures w14:val="standardContextual"/>
         </w:rPr>
       </w:pPr>
-      <w:hyperlink w:anchor="_Toc242440630" w:history="1">
+      <w:hyperlink w:anchor="_Toc242473796" w:history="1">
         <w:r>
           <w:rPr>
             <w:rStyle w:val="Hyperlink"/>
@@ -3259,7 +3259,7 @@
             <w:noProof/>
             <w:webHidden/>
           </w:rPr>
-          <w:instrText xml:space="preserve"> PAGEREF _Toc242440630 \h </w:instrText>
+          <w:instrText xml:space="preserve"> PAGEREF _Toc242473796 \h </w:instrText>
         </w:r>
         <w:r>
           <w:rPr>
@@ -3307,7 +3307,7 @@
           <w14:ligatures w14:val="standardContextual"/>
         </w:rPr>
       </w:pPr>
-      <w:hyperlink w:anchor="_Toc242440631" w:history="1">
+      <w:hyperlink w:anchor="_Toc242473797" w:history="1">
         <w:r>
           <w:rPr>
             <w:rStyle w:val="Hyperlink"/>
@@ -3334,7 +3334,7 @@
             <w:noProof/>
             <w:webHidden/>
           </w:rPr>
-          <w:instrText xml:space="preserve"> PAGEREF _Toc242440631 \h </w:instrText>
+          <w:instrText xml:space="preserve"> PAGEREF _Toc242473797 \h </w:instrText>
         </w:r>
         <w:r>
           <w:rPr>
@@ -3382,7 +3382,7 @@
           <w14:ligatures w14:val="standardContextual"/>
         </w:rPr>
       </w:pPr>
-      <w:hyperlink w:anchor="_Toc242440632" w:history="1">
+      <w:hyperlink w:anchor="_Toc242473798" w:history="1">
         <w:r>
           <w:rPr>
             <w:rStyle w:val="Hyperlink"/>
@@ -3409,7 +3409,7 @@
             <w:noProof/>
             <w:webHidden/>
           </w:rPr>
-          <w:instrText xml:space="preserve"> PAGEREF _Toc242440632 \h </w:instrText>
+          <w:instrText xml:space="preserve"> PAGEREF _Toc242473798 \h </w:instrText>
         </w:r>
         <w:r>
           <w:rPr>
@@ -3457,7 +3457,7 @@
           <w14:ligatures w14:val="standardContextual"/>
         </w:rPr>
       </w:pPr>
-      <w:hyperlink w:anchor="_Toc242440633" w:history="1">
+      <w:hyperlink w:anchor="_Toc242473799" w:history="1">
         <w:r>
           <w:rPr>
             <w:rStyle w:val="Hyperlink"/>
@@ -3484,7 +3484,7 @@
             <w:noProof/>
             <w:webHidden/>
           </w:rPr>
-          <w:instrText xml:space="preserve"> PAGEREF _Toc242440633 \h </w:instrText>
+          <w:instrText xml:space="preserve"> PAGEREF _Toc242473799 \h </w:instrText>
         </w:r>
         <w:r>
           <w:rPr>
@@ -3532,7 +3532,7 @@
           <w14:ligatures w14:val="standardContextual"/>
         </w:rPr>
       </w:pPr>
-      <w:hyperlink w:anchor="_Toc242440634" w:history="1">
+      <w:hyperlink w:anchor="_Toc242473800" w:history="1">
         <w:r>
           <w:rPr>
             <w:rStyle w:val="Hyperlink"/>
@@ -3559,7 +3559,7 @@
             <w:noProof/>
             <w:webHidden/>
           </w:rPr>
-          <w:instrText xml:space="preserve"> PAGEREF _Toc242440634 \h </w:instrText>
+          <w:instrText xml:space="preserve"> PAGEREF _Toc242473800 \h </w:instrText>
         </w:r>
         <w:r>
           <w:rPr>
@@ -3607,7 +3607,7 @@
           <w14:ligatures w14:val="standardContextual"/>
         </w:rPr>
       </w:pPr>
-      <w:hyperlink w:anchor="_Toc242440635" w:history="1">
+      <w:hyperlink w:anchor="_Toc242473801" w:history="1">
         <w:r>
           <w:rPr>
             <w:rStyle w:val="Hyperlink"/>
@@ -3634,7 +3634,7 @@
             <w:noProof/>
             <w:webHidden/>
           </w:rPr>
-          <w:instrText xml:space="preserve"> PAGEREF _Toc242440635 \h </w:instrText>
+          <w:instrText xml:space="preserve"> PAGEREF _Toc242473801 \h </w:instrText>
         </w:r>
         <w:r>
           <w:rPr>
@@ -3675,7 +3675,7 @@
         <w:pStyle w:val="Heading1"/>
         <w:pageBreakBefore/>
       </w:pPr>
-      <w:bookmarkStart w:id="0" w:name="_Toc242440594"/>
+      <w:bookmarkStart w:id="0" w:name="_Toc242473760"/>
       <w:r>
         <w:t>1 Introducción</w:t>
       </w:r>
@@ -3685,7 +3685,7 @@
       <w:pPr>
         <w:pStyle w:val="Heading2"/>
       </w:pPr>
-      <w:bookmarkStart w:id="1" w:name="_Toc242440595"/>
+      <w:bookmarkStart w:id="1" w:name="_Toc242473761"/>
       <w:r>
         <w:t>1.1 Propósito y alcance</w:t>
       </w:r>
@@ -3995,7 +3995,7 @@
               <w:rPr>
                 <w:sz w:val="20"/>
               </w:rPr>
-              <w:t>Contenedor en una plataforma como servicio; la URL (</w:t>
+              <w:t xml:space="preserve">Contenedor en una plataforma como servicio, publicado en https://donatrack-logistica-0op2.onrender.com (URL, </w:t>
             </w:r>
             <w:r>
               <w:rPr>
@@ -4008,7 +4008,7 @@
               <w:rPr>
                 <w:sz w:val="20"/>
               </w:rPr>
-              <w:t>) pública todavía no está publicada</w:t>
+              <w:t>)</w:t>
             </w:r>
           </w:p>
         </w:tc>
@@ -4039,7 +4039,7 @@
       <w:pPr>
         <w:pStyle w:val="Heading2"/>
       </w:pPr>
-      <w:bookmarkStart w:id="2" w:name="_Toc242440596"/>
+      <w:bookmarkStart w:id="2" w:name="_Toc242473762"/>
       <w:r>
         <w:t>1.2 Mapa de servicios</w:t>
       </w:r>
@@ -4499,7 +4499,7 @@
       <w:pPr>
         <w:pStyle w:val="Heading2"/>
       </w:pPr>
-      <w:bookmarkStart w:id="3" w:name="_Toc242440597"/>
+      <w:bookmarkStart w:id="3" w:name="_Toc242473763"/>
       <w:r>
         <w:t>1.3 Cómo leer este documento</w:t>
       </w:r>
@@ -4565,7 +4565,7 @@
       <w:pPr>
         <w:pStyle w:val="Heading2"/>
       </w:pPr>
-      <w:bookmarkStart w:id="4" w:name="_Toc242440598"/>
+      <w:bookmarkStart w:id="4" w:name="_Toc242473764"/>
       <w:r>
         <w:t>1.4 Relación con otros entregables</w:t>
       </w:r>
@@ -4589,7 +4589,7 @@
       <w:pPr>
         <w:pStyle w:val="Heading1"/>
       </w:pPr>
-      <w:bookmarkStart w:id="5" w:name="_Toc242440599"/>
+      <w:bookmarkStart w:id="5" w:name="_Toc242473765"/>
       <w:r>
         <w:t>2 Atributos de calidad</w:t>
       </w:r>
@@ -5152,7 +5152,7 @@
       <w:pPr>
         <w:pStyle w:val="Heading1"/>
       </w:pPr>
-      <w:bookmarkStart w:id="6" w:name="_Toc242440600"/>
+      <w:bookmarkStart w:id="6" w:name="_Toc242473766"/>
       <w:r>
         <w:t>3 Arquitectura orientada a servicios (microservicios)</w:t>
       </w:r>
@@ -5162,7 +5162,7 @@
       <w:pPr>
         <w:pStyle w:val="Heading2"/>
       </w:pPr>
-      <w:bookmarkStart w:id="7" w:name="_Toc242440601"/>
+      <w:bookmarkStart w:id="7" w:name="_Toc242473767"/>
       <w:r>
         <w:t>3.1 Definición operativa</w:t>
       </w:r>
@@ -5240,7 +5240,7 @@
       <w:pPr>
         <w:pStyle w:val="Heading2"/>
       </w:pPr>
-      <w:bookmarkStart w:id="8" w:name="_Toc242440602"/>
+      <w:bookmarkStart w:id="8" w:name="_Toc242473768"/>
       <w:r>
         <w:t>3.2 Regla de comunicación</w:t>
       </w:r>
@@ -5265,7 +5265,7 @@
           <w:noProof/>
         </w:rPr>
         <w:drawing>
-          <wp:inline distT="0" distB="0" distL="0" distR="0" wp14:anchorId="7BAB1849" wp14:editId="6DCF9038">
+          <wp:inline distT="0" distB="0" distL="0" distR="0" wp14:anchorId="79E303D5" wp14:editId="1516FA31">
             <wp:extent cx="3957534" cy="6176712"/>
             <wp:effectExtent l="0" t="0" r="0" b="0"/>
             <wp:docPr id="1" name="Picture 1"/>
@@ -5321,7 +5321,7 @@
       <w:pPr>
         <w:pStyle w:val="Heading2"/>
       </w:pPr>
-      <w:bookmarkStart w:id="9" w:name="_Toc242440603"/>
+      <w:bookmarkStart w:id="9" w:name="_Toc242473769"/>
       <w:r>
         <w:t>3.3 Infraestructura y núcleo compartidos</w:t>
       </w:r>
@@ -5363,7 +5363,7 @@
       <w:pPr>
         <w:pStyle w:val="Heading2"/>
       </w:pPr>
-      <w:bookmarkStart w:id="10" w:name="_Toc242440604"/>
+      <w:bookmarkStart w:id="10" w:name="_Toc242473770"/>
       <w:r>
         <w:t>3.4 Decisión de estilo</w:t>
       </w:r>
@@ -5710,7 +5710,7 @@
       <w:pPr>
         <w:pStyle w:val="Heading1"/>
       </w:pPr>
-      <w:bookmarkStart w:id="11" w:name="_Toc242440605"/>
+      <w:bookmarkStart w:id="11" w:name="_Toc242473771"/>
       <w:r>
         <w:t>4 Capas e inversión de dependencias</w:t>
       </w:r>
@@ -5720,7 +5720,7 @@
       <w:pPr>
         <w:pStyle w:val="Heading2"/>
       </w:pPr>
-      <w:bookmarkStart w:id="12" w:name="_Toc242440606"/>
+      <w:bookmarkStart w:id="12" w:name="_Toc242473772"/>
       <w:r>
         <w:t>4.1 Capas</w:t>
       </w:r>
@@ -5810,7 +5810,7 @@
           <w:noProof/>
         </w:rPr>
         <w:drawing>
-          <wp:inline distT="0" distB="0" distL="0" distR="0" wp14:anchorId="4EDC9D2B" wp14:editId="008658F6">
+          <wp:inline distT="0" distB="0" distL="0" distR="0" wp14:anchorId="2D88EE5D" wp14:editId="792D20FA">
             <wp:extent cx="4393972" cy="4882191"/>
             <wp:effectExtent l="0" t="0" r="0" b="0"/>
             <wp:docPr id="2" name="Picture 2"/>
@@ -5866,7 +5866,7 @@
       <w:pPr>
         <w:pStyle w:val="Heading2"/>
       </w:pPr>
-      <w:bookmarkStart w:id="13" w:name="_Toc242440607"/>
+      <w:bookmarkStart w:id="13" w:name="_Toc242473773"/>
       <w:r>
         <w:t>4.2 Regla de dependencia y composición</w:t>
       </w:r>
@@ -5893,7 +5893,7 @@
       <w:pPr>
         <w:pStyle w:val="Heading2"/>
       </w:pPr>
-      <w:bookmarkStart w:id="14" w:name="_Toc242440608"/>
+      <w:bookmarkStart w:id="14" w:name="_Toc242473774"/>
       <w:r>
         <w:t>4.3 Decisión de organización interna</w:t>
       </w:r>
@@ -6259,7 +6259,7 @@
       <w:pPr>
         <w:pStyle w:val="Heading1"/>
       </w:pPr>
-      <w:bookmarkStart w:id="15" w:name="_Toc242440609"/>
+      <w:bookmarkStart w:id="15" w:name="_Toc242473775"/>
       <w:r>
         <w:t>5 Principios SOLID y patrones de diseño</w:t>
       </w:r>
@@ -6269,7 +6269,7 @@
       <w:pPr>
         <w:pStyle w:val="Heading2"/>
       </w:pPr>
-      <w:bookmarkStart w:id="16" w:name="_Toc242440610"/>
+      <w:bookmarkStart w:id="16" w:name="_Toc242473776"/>
       <w:r>
         <w:t>5.1 Principios</w:t>
       </w:r>
@@ -6356,7 +6356,7 @@
       <w:pPr>
         <w:pStyle w:val="Heading2"/>
       </w:pPr>
-      <w:bookmarkStart w:id="17" w:name="_Toc242440611"/>
+      <w:bookmarkStart w:id="17" w:name="_Toc242473777"/>
       <w:r>
         <w:t>5.2 Patrones</w:t>
       </w:r>
@@ -7015,7 +7015,7 @@
       <w:pPr>
         <w:pStyle w:val="Heading1"/>
       </w:pPr>
-      <w:bookmarkStart w:id="18" w:name="_Toc242440612"/>
+      <w:bookmarkStart w:id="18" w:name="_Toc242473778"/>
       <w:r>
         <w:t>6 Estrategia de integración</w:t>
       </w:r>
@@ -7025,7 +7025,7 @@
       <w:pPr>
         <w:pStyle w:val="Heading2"/>
       </w:pPr>
-      <w:bookmarkStart w:id="19" w:name="_Toc242440613"/>
+      <w:bookmarkStart w:id="19" w:name="_Toc242473779"/>
       <w:r>
         <w:t>6.1 Mapa de comunicación</w:t>
       </w:r>
@@ -7530,7 +7530,7 @@
       <w:pPr>
         <w:pStyle w:val="Heading2"/>
       </w:pPr>
-      <w:bookmarkStart w:id="20" w:name="_Toc242440614"/>
+      <w:bookmarkStart w:id="20" w:name="_Toc242473780"/>
       <w:r>
         <w:t>6.2 Cola hacia Notificaciones</w:t>
       </w:r>
@@ -7939,7 +7939,7 @@
       <w:pPr>
         <w:pStyle w:val="Heading2"/>
       </w:pPr>
-      <w:bookmarkStart w:id="21" w:name="_Toc242440615"/>
+      <w:bookmarkStart w:id="21" w:name="_Toc242473781"/>
       <w:r>
         <w:t>6.3 Broker de integración con logística</w:t>
       </w:r>
@@ -8070,7 +8070,7 @@
           <w:noProof/>
         </w:rPr>
         <w:drawing>
-          <wp:inline distT="0" distB="0" distL="0" distR="0" wp14:anchorId="3D0F7CC8" wp14:editId="1632CCF7">
+          <wp:inline distT="0" distB="0" distL="0" distR="0" wp14:anchorId="535703B1" wp14:editId="4C35744B">
             <wp:extent cx="5032103" cy="7199999"/>
             <wp:effectExtent l="0" t="0" r="0" b="0"/>
             <wp:docPr id="3" name="Picture 3"/>
@@ -8483,7 +8483,7 @@
       <w:pPr>
         <w:pStyle w:val="Heading2"/>
       </w:pPr>
-      <w:bookmarkStart w:id="22" w:name="_Toc242440616"/>
+      <w:bookmarkStart w:id="22" w:name="_Toc242473782"/>
       <w:r>
         <w:t>6.4 Vuelta del estado</w:t>
       </w:r>
@@ -8843,7 +8843,7 @@
       <w:pPr>
         <w:pStyle w:val="Heading2"/>
       </w:pPr>
-      <w:bookmarkStart w:id="23" w:name="_Toc242440617"/>
+      <w:bookmarkStart w:id="23" w:name="_Toc242473783"/>
       <w:r>
         <w:t>6.5 Restricciones heredadas de la Entrega 3</w:t>
       </w:r>
@@ -9095,7 +9095,7 @@
       <w:pPr>
         <w:pStyle w:val="Heading1"/>
       </w:pPr>
-      <w:bookmarkStart w:id="24" w:name="_Toc242440618"/>
+      <w:bookmarkStart w:id="24" w:name="_Toc242473784"/>
       <w:r>
         <w:t>7 Persistencia</w:t>
       </w:r>
@@ -9190,7 +9190,7 @@
           <w:noProof/>
         </w:rPr>
         <w:drawing>
-          <wp:inline distT="0" distB="0" distL="0" distR="0" wp14:anchorId="35EDE989" wp14:editId="03250364">
+          <wp:inline distT="0" distB="0" distL="0" distR="0" wp14:anchorId="39BB36AA" wp14:editId="5E2CF44B">
             <wp:extent cx="4948767" cy="4083288"/>
             <wp:effectExtent l="0" t="0" r="0" b="0"/>
             <wp:docPr id="4" name="Picture 4"/>
@@ -9992,7 +9992,7 @@
       <w:pPr>
         <w:pStyle w:val="Heading1"/>
       </w:pPr>
-      <w:bookmarkStart w:id="25" w:name="_Toc242440619"/>
+      <w:bookmarkStart w:id="25" w:name="_Toc242473785"/>
       <w:r>
         <w:t>8 Estrategia y tipos de pruebas</w:t>
       </w:r>
@@ -10849,7 +10849,7 @@
       <w:pPr>
         <w:pStyle w:val="Heading1"/>
       </w:pPr>
-      <w:bookmarkStart w:id="26" w:name="_Toc242440620"/>
+      <w:bookmarkStart w:id="26" w:name="_Toc242473786"/>
       <w:r>
         <w:t>9 Despliegue</w:t>
       </w:r>
@@ -10859,7 +10859,7 @@
       <w:pPr>
         <w:pStyle w:val="Heading2"/>
       </w:pPr>
-      <w:bookmarkStart w:id="27" w:name="_Toc242440621"/>
+      <w:bookmarkStart w:id="27" w:name="_Toc242473787"/>
       <w:r>
         <w:t>9.1 Contenedores</w:t>
       </w:r>
@@ -10926,7 +10926,7 @@
           <w:noProof/>
         </w:rPr>
         <w:drawing>
-          <wp:inline distT="0" distB="0" distL="0" distR="0" wp14:anchorId="3DFFC5E8" wp14:editId="18582011">
+          <wp:inline distT="0" distB="0" distL="0" distR="0" wp14:anchorId="7DA4C798" wp14:editId="358A1711">
             <wp:extent cx="4253424" cy="3513698"/>
             <wp:effectExtent l="0" t="0" r="0" b="0"/>
             <wp:docPr id="5" name="Picture 5"/>
@@ -10982,7 +10982,7 @@
       <w:pPr>
         <w:pStyle w:val="Heading2"/>
       </w:pPr>
-      <w:bookmarkStart w:id="28" w:name="_Toc242440622"/>
+      <w:bookmarkStart w:id="28" w:name="_Toc242473788"/>
       <w:r>
         <w:t>9.2 Entornos</w:t>
       </w:r>
@@ -11255,7 +11255,7 @@
               <w:rPr>
                 <w:sz w:val="20"/>
               </w:rPr>
-              <w:t>Imagen y configuración listas; falta publicar la URL</w:t>
+              <w:t>Publicado y accesible por HTTPS</w:t>
             </w:r>
           </w:p>
         </w:tc>
@@ -11268,14 +11268,14 @@
     </w:p>
     <w:p>
       <w:r>
-        <w:t>La URL pública de Logística todavía no está publicada; se completará antes de la defensa. Para eso, Donaciones y Logística deben compartir RabbitMQ en la nube y fijar la URL de callback de planificación.</w:t>
+        <w:t>Logística está publicada en https://donatrack-logistica-0op2.onrender.com; la documentación interactiva de su API está en Swagger UI, en la misma dirección. Para la demo integrada en la nube falta que Donaciones comparta RabbitMQ con Logística y fijar la URL de callback de planificación.</w:t>
       </w:r>
     </w:p>
     <w:p>
       <w:pPr>
         <w:pStyle w:val="Heading2"/>
       </w:pPr>
-      <w:bookmarkStart w:id="29" w:name="_Toc242440623"/>
+      <w:bookmarkStart w:id="29" w:name="_Toc242473789"/>
       <w:r>
         <w:t>9.3 Decisión de plataforma</w:t>
       </w:r>
@@ -11626,7 +11626,7 @@
               <w:rPr>
                 <w:sz w:val="20"/>
               </w:rPr>
-              <w:t>La URL pública todavía no está publicada.</w:t>
+              <w:t>En el plan gratuito, la instancia se suspende sin tráfico: la primera respuesta puede tardar cerca de un minuto.</w:t>
             </w:r>
           </w:p>
         </w:tc>
@@ -11686,7 +11686,7 @@
       <w:pPr>
         <w:pStyle w:val="Heading1"/>
       </w:pPr>
-      <w:bookmarkStart w:id="30" w:name="_Toc242440624"/>
+      <w:bookmarkStart w:id="30" w:name="_Toc242473790"/>
       <w:r>
         <w:t>10 Decisiones diferidas y trade-offs asumidos</w:t>
       </w:r>
@@ -11696,7 +11696,7 @@
       <w:pPr>
         <w:pStyle w:val="Heading2"/>
       </w:pPr>
-      <w:bookmarkStart w:id="31" w:name="_Toc242440625"/>
+      <w:bookmarkStart w:id="31" w:name="_Toc242473791"/>
       <w:r>
         <w:t>10.1 Garantías que hoy no ofrecemos</w:t>
       </w:r>
@@ -11989,7 +11989,7 @@
       <w:pPr>
         <w:pStyle w:val="Heading2"/>
       </w:pPr>
-      <w:bookmarkStart w:id="32" w:name="_Toc242440626"/>
+      <w:bookmarkStart w:id="32" w:name="_Toc242473792"/>
       <w:r>
         <w:t>10.2 Deuda agrupada</w:t>
       </w:r>
@@ -12352,7 +12352,7 @@
               <w:rPr>
                 <w:sz w:val="20"/>
               </w:rPr>
-              <w:t>URL todavía sin publicar; callback de la segunda instancia sin configurar</w:t>
+              <w:t>Callback de la segunda instancia sin configurar; RabbitMQ en la nube todavía no compartido con Donaciones</w:t>
             </w:r>
           </w:p>
         </w:tc>
@@ -12368,7 +12368,7 @@
               <w:rPr>
                 <w:sz w:val="20"/>
               </w:rPr>
-              <w:t>Publicar la URL y configurar la mensajería en la nube</w:t>
+              <w:t>Configurar la mensajería en la nube</w:t>
             </w:r>
           </w:p>
         </w:tc>
@@ -12437,7 +12437,7 @@
         <w:pStyle w:val="Heading1"/>
         <w:pageBreakBefore/>
       </w:pPr>
-      <w:bookmarkStart w:id="33" w:name="_Toc242440627"/>
+      <w:bookmarkStart w:id="33" w:name="_Toc242473793"/>
       <w:r>
         <w:t>11 Cómo aplica la arquitectura cada servicio</w:t>
       </w:r>
@@ -12452,7 +12452,7 @@
       <w:pPr>
         <w:pStyle w:val="Heading2"/>
       </w:pPr>
-      <w:bookmarkStart w:id="34" w:name="_Toc242440628"/>
+      <w:bookmarkStart w:id="34" w:name="_Toc242473794"/>
       <w:r>
         <w:t>11.1 Donaciones</w:t>
       </w:r>
@@ -13091,7 +13091,7 @@
               <w:rPr>
                 <w:sz w:val="20"/>
               </w:rPr>
-              <w:t>prioriza el requisito de integración; los puertos admiten JPA sin tocar el dominio.</w:t>
+              <w:t>la persistencia relacional de Donaciones no era requisito de la entrega; el esfuerzo fue al broker de integración y los puertos admiten JPA sin tocar el dominio.</w:t>
             </w:r>
           </w:p>
         </w:tc>
@@ -13138,7 +13138,7 @@
               <w:rPr>
                 <w:sz w:val="20"/>
               </w:rPr>
-              <w:t>El requisito de persistencia relacional queda cubierto en tres de los cuatro servicios.</w:t>
+              <w:t>La persistencia relacional queda aplicada en tres de los cuatro servicios.</w:t>
             </w:r>
           </w:p>
           <w:p>
@@ -13212,7 +13212,7 @@
         <w:pStyle w:val="Heading2"/>
         <w:pageBreakBefore/>
       </w:pPr>
-      <w:bookmarkStart w:id="35" w:name="_Toc242440629"/>
+      <w:bookmarkStart w:id="35" w:name="_Toc242473795"/>
       <w:r>
         <w:t>11.2 Logística</w:t>
       </w:r>
@@ -13602,7 +13602,7 @@
               <w:rPr>
                 <w:sz w:val="20"/>
               </w:rPr>
-              <w:t>Único servicio en la nube; la URL todavía no está publicada</w:t>
+              <w:t>Único servicio en la nube, publicado en Render</w:t>
             </w:r>
           </w:p>
         </w:tc>
@@ -13977,7 +13977,7 @@
         <w:pStyle w:val="Heading2"/>
         <w:pageBreakBefore/>
       </w:pPr>
-      <w:bookmarkStart w:id="36" w:name="_Toc242440630"/>
+      <w:bookmarkStart w:id="36" w:name="_Toc242473796"/>
       <w:r>
         <w:t>11.3 Notificaciones</w:t>
       </w:r>
@@ -14749,7 +14749,7 @@
         <w:pStyle w:val="Heading2"/>
         <w:pageBreakBefore/>
       </w:pPr>
-      <w:bookmarkStart w:id="37" w:name="_Toc242440631"/>
+      <w:bookmarkStart w:id="37" w:name="_Toc242473797"/>
       <w:r>
         <w:t>11.4 Incentivos</w:t>
       </w:r>
@@ -15501,7 +15501,7 @@
         <w:pStyle w:val="Heading1"/>
         <w:pageBreakBefore/>
       </w:pPr>
-      <w:bookmarkStart w:id="38" w:name="_Toc242440632"/>
+      <w:bookmarkStart w:id="38" w:name="_Toc242473798"/>
       <w:r>
         <w:t>Anexo A. Índice de decisiones</w:t>
       </w:r>
@@ -15949,7 +15949,7 @@
         <w:pStyle w:val="Heading1"/>
         <w:pageBreakBefore/>
       </w:pPr>
-      <w:bookmarkStart w:id="39" w:name="_Toc242440633"/>
+      <w:bookmarkStart w:id="39" w:name="_Toc242473799"/>
       <w:r>
         <w:t>Anexo B. Trazabilidad de requisitos</w:t>
       </w:r>
@@ -16191,7 +16191,7 @@
               <w:rPr>
                 <w:sz w:val="20"/>
               </w:rPr>
-              <w:t>Capítulo 9 y Figura 5. La URL todavía no está publicada</w:t>
+              <w:t>Capítulo 9 y Figura 5. Publicada en https://donatrack-logistica-0op2.onrender.com</w:t>
             </w:r>
           </w:p>
         </w:tc>
@@ -16614,7 +16614,7 @@
         <w:pStyle w:val="Heading1"/>
         <w:pageBreakBefore/>
       </w:pPr>
-      <w:bookmarkStart w:id="40" w:name="_Toc242440634"/>
+      <w:bookmarkStart w:id="40" w:name="_Toc242473800"/>
       <w:r>
         <w:t>Anexo C. Deuda técnica</w:t>
       </w:r>
@@ -17507,7 +17507,7 @@
               <w:rPr>
                 <w:sz w:val="20"/>
               </w:rPr>
-              <w:t>URL todavía sin publicar; no reproducible; mensajería compartida sin configurar</w:t>
+              <w:t>No reproducible desde el repositorio; mensajería compartida sin configurar</w:t>
             </w:r>
           </w:p>
         </w:tc>
@@ -17523,7 +17523,7 @@
               <w:rPr>
                 <w:sz w:val="20"/>
               </w:rPr>
-              <w:t>Publicar la URL y configurar CloudAMQP en ambos servicios antes de la defensa</w:t>
+              <w:t>Configurar CloudAMQP en ambos servicios antes de la defensa</w:t>
             </w:r>
           </w:p>
         </w:tc>
@@ -17751,7 +17751,7 @@
         <w:pStyle w:val="Heading1"/>
         <w:pageBreakBefore/>
       </w:pPr>
-      <w:bookmarkStart w:id="41" w:name="_Toc242440635"/>
+      <w:bookmarkStart w:id="41" w:name="_Toc242473801"/>
       <w:r>
         <w:t>Anexo D. Glosario y siglas</w:t>
       </w:r>
@@ -19415,31 +19415,31 @@
       </w:rPr>
     </w:lvl>
   </w:abstractNum>
-  <w:num w:numId="1" w16cid:durableId="690758948">
+  <w:num w:numId="1" w16cid:durableId="1364289161">
     <w:abstractNumId w:val="8"/>
   </w:num>
-  <w:num w:numId="2" w16cid:durableId="847449563">
+  <w:num w:numId="2" w16cid:durableId="1480028403">
     <w:abstractNumId w:val="6"/>
   </w:num>
-  <w:num w:numId="3" w16cid:durableId="2115056564">
+  <w:num w:numId="3" w16cid:durableId="63571710">
     <w:abstractNumId w:val="5"/>
   </w:num>
-  <w:num w:numId="4" w16cid:durableId="1032223031">
+  <w:num w:numId="4" w16cid:durableId="468983793">
     <w:abstractNumId w:val="4"/>
   </w:num>
-  <w:num w:numId="5" w16cid:durableId="127937952">
+  <w:num w:numId="5" w16cid:durableId="650867906">
     <w:abstractNumId w:val="7"/>
   </w:num>
-  <w:num w:numId="6" w16cid:durableId="1103695826">
+  <w:num w:numId="6" w16cid:durableId="559825300">
     <w:abstractNumId w:val="3"/>
   </w:num>
-  <w:num w:numId="7" w16cid:durableId="1814789487">
+  <w:num w:numId="7" w16cid:durableId="312219916">
     <w:abstractNumId w:val="2"/>
   </w:num>
-  <w:num w:numId="8" w16cid:durableId="2003116878">
+  <w:num w:numId="8" w16cid:durableId="1419864417">
     <w:abstractNumId w:val="1"/>
   </w:num>
-  <w:num w:numId="9" w16cid:durableId="1158839209">
+  <w:num w:numId="9" w16cid:durableId="777677059">
     <w:abstractNumId w:val="0"/>
   </w:num>
 </w:numbering>
@@ -30828,7 +30828,7 @@
     <w:autoRedefine/>
     <w:uiPriority w:val="39"/>
     <w:unhideWhenUsed/>
-    <w:rsid w:val="00E12D86"/>
+    <w:rsid w:val="00CC28F3"/>
     <w:pPr>
       <w:spacing w:after="100"/>
     </w:pPr>
@@ -30840,7 +30840,7 @@
     <w:autoRedefine/>
     <w:uiPriority w:val="39"/>
     <w:unhideWhenUsed/>
-    <w:rsid w:val="00E12D86"/>
+    <w:rsid w:val="00CC28F3"/>
     <w:pPr>
       <w:spacing w:after="100"/>
       <w:ind w:left="220"/>
@@ -30851,7 +30851,7 @@
     <w:basedOn w:val="DefaultParagraphFont"/>
     <w:uiPriority w:val="99"/>
     <w:unhideWhenUsed/>
-    <w:rsid w:val="00E12D86"/>
+    <w:rsid w:val="00CC28F3"/>
     <w:rPr>
       <w:color w:val="0000FF" w:themeColor="hyperlink"/>
       <w:u w:val="single"/>

</xml_diff>

<commit_message>
docs(entrega-4): el diagrama de componentes muestra la arquitectura objetivo
El entregable 4 representa la arquitectura deseada, no el estado actual.
Se rotula así en el informe, el respaldo técnico y los índices, y se
declaran sus tres diferencias con el código: Donaciones en memoria, MinIO
solo en Incentivos y medios de notificación simulados dentro del proceso.

Co-Authored-By: Claude Opus 5.5 <noreply@anthropic.com>
</commit_message>
<xml_diff>
--- a/docs/entrega-4/arquitectura/entregable-5/arquitectura-sistema-e4.docx
+++ b/docs/entrega-4/arquitectura/entregable-5/arquitectura-sistema-e4.docx
@@ -532,7 +532,7 @@
       <w:r>
         <w:fldChar w:fldCharType="separate"/>
       </w:r>
-      <w:hyperlink w:anchor="_Toc242473760" w:history="1">
+      <w:hyperlink w:anchor="_Toc242473936" w:history="1">
         <w:r>
           <w:rPr>
             <w:rStyle w:val="Hyperlink"/>
@@ -559,7 +559,7 @@
             <w:noProof/>
             <w:webHidden/>
           </w:rPr>
-          <w:instrText xml:space="preserve"> PAGEREF _Toc242473760 \h </w:instrText>
+          <w:instrText xml:space="preserve"> PAGEREF _Toc242473936 \h </w:instrText>
         </w:r>
         <w:r>
           <w:rPr>
@@ -607,7 +607,7 @@
           <w14:ligatures w14:val="standardContextual"/>
         </w:rPr>
       </w:pPr>
-      <w:hyperlink w:anchor="_Toc242473761" w:history="1">
+      <w:hyperlink w:anchor="_Toc242473937" w:history="1">
         <w:r>
           <w:rPr>
             <w:rStyle w:val="Hyperlink"/>
@@ -634,7 +634,7 @@
             <w:noProof/>
             <w:webHidden/>
           </w:rPr>
-          <w:instrText xml:space="preserve"> PAGEREF _Toc242473761 \h </w:instrText>
+          <w:instrText xml:space="preserve"> PAGEREF _Toc242473937 \h </w:instrText>
         </w:r>
         <w:r>
           <w:rPr>
@@ -682,7 +682,7 @@
           <w14:ligatures w14:val="standardContextual"/>
         </w:rPr>
       </w:pPr>
-      <w:hyperlink w:anchor="_Toc242473762" w:history="1">
+      <w:hyperlink w:anchor="_Toc242473938" w:history="1">
         <w:r>
           <w:rPr>
             <w:rStyle w:val="Hyperlink"/>
@@ -709,7 +709,7 @@
             <w:noProof/>
             <w:webHidden/>
           </w:rPr>
-          <w:instrText xml:space="preserve"> PAGEREF _Toc242473762 \h </w:instrText>
+          <w:instrText xml:space="preserve"> PAGEREF _Toc242473938 \h </w:instrText>
         </w:r>
         <w:r>
           <w:rPr>
@@ -757,7 +757,7 @@
           <w14:ligatures w14:val="standardContextual"/>
         </w:rPr>
       </w:pPr>
-      <w:hyperlink w:anchor="_Toc242473763" w:history="1">
+      <w:hyperlink w:anchor="_Toc242473939" w:history="1">
         <w:r>
           <w:rPr>
             <w:rStyle w:val="Hyperlink"/>
@@ -784,7 +784,7 @@
             <w:noProof/>
             <w:webHidden/>
           </w:rPr>
-          <w:instrText xml:space="preserve"> PAGEREF _Toc242473763 \h </w:instrText>
+          <w:instrText xml:space="preserve"> PAGEREF _Toc242473939 \h </w:instrText>
         </w:r>
         <w:r>
           <w:rPr>
@@ -832,7 +832,7 @@
           <w14:ligatures w14:val="standardContextual"/>
         </w:rPr>
       </w:pPr>
-      <w:hyperlink w:anchor="_Toc242473764" w:history="1">
+      <w:hyperlink w:anchor="_Toc242473940" w:history="1">
         <w:r>
           <w:rPr>
             <w:rStyle w:val="Hyperlink"/>
@@ -859,7 +859,7 @@
             <w:noProof/>
             <w:webHidden/>
           </w:rPr>
-          <w:instrText xml:space="preserve"> PAGEREF _Toc242473764 \h </w:instrText>
+          <w:instrText xml:space="preserve"> PAGEREF _Toc242473940 \h </w:instrText>
         </w:r>
         <w:r>
           <w:rPr>
@@ -907,7 +907,7 @@
           <w14:ligatures w14:val="standardContextual"/>
         </w:rPr>
       </w:pPr>
-      <w:hyperlink w:anchor="_Toc242473765" w:history="1">
+      <w:hyperlink w:anchor="_Toc242473941" w:history="1">
         <w:r>
           <w:rPr>
             <w:rStyle w:val="Hyperlink"/>
@@ -934,7 +934,7 @@
             <w:noProof/>
             <w:webHidden/>
           </w:rPr>
-          <w:instrText xml:space="preserve"> PAGEREF _Toc242473765 \h </w:instrText>
+          <w:instrText xml:space="preserve"> PAGEREF _Toc242473941 \h </w:instrText>
         </w:r>
         <w:r>
           <w:rPr>
@@ -982,7 +982,7 @@
           <w14:ligatures w14:val="standardContextual"/>
         </w:rPr>
       </w:pPr>
-      <w:hyperlink w:anchor="_Toc242473766" w:history="1">
+      <w:hyperlink w:anchor="_Toc242473942" w:history="1">
         <w:r>
           <w:rPr>
             <w:rStyle w:val="Hyperlink"/>
@@ -1009,7 +1009,7 @@
             <w:noProof/>
             <w:webHidden/>
           </w:rPr>
-          <w:instrText xml:space="preserve"> PAGEREF _Toc242473766 \h </w:instrText>
+          <w:instrText xml:space="preserve"> PAGEREF _Toc242473942 \h </w:instrText>
         </w:r>
         <w:r>
           <w:rPr>
@@ -1057,7 +1057,7 @@
           <w14:ligatures w14:val="standardContextual"/>
         </w:rPr>
       </w:pPr>
-      <w:hyperlink w:anchor="_Toc242473767" w:history="1">
+      <w:hyperlink w:anchor="_Toc242473943" w:history="1">
         <w:r>
           <w:rPr>
             <w:rStyle w:val="Hyperlink"/>
@@ -1084,7 +1084,7 @@
             <w:noProof/>
             <w:webHidden/>
           </w:rPr>
-          <w:instrText xml:space="preserve"> PAGEREF _Toc242473767 \h </w:instrText>
+          <w:instrText xml:space="preserve"> PAGEREF _Toc242473943 \h </w:instrText>
         </w:r>
         <w:r>
           <w:rPr>
@@ -1132,7 +1132,7 @@
           <w14:ligatures w14:val="standardContextual"/>
         </w:rPr>
       </w:pPr>
-      <w:hyperlink w:anchor="_Toc242473768" w:history="1">
+      <w:hyperlink w:anchor="_Toc242473944" w:history="1">
         <w:r>
           <w:rPr>
             <w:rStyle w:val="Hyperlink"/>
@@ -1159,7 +1159,7 @@
             <w:noProof/>
             <w:webHidden/>
           </w:rPr>
-          <w:instrText xml:space="preserve"> PAGEREF _Toc242473768 \h </w:instrText>
+          <w:instrText xml:space="preserve"> PAGEREF _Toc242473944 \h </w:instrText>
         </w:r>
         <w:r>
           <w:rPr>
@@ -1207,7 +1207,7 @@
           <w14:ligatures w14:val="standardContextual"/>
         </w:rPr>
       </w:pPr>
-      <w:hyperlink w:anchor="_Toc242473769" w:history="1">
+      <w:hyperlink w:anchor="_Toc242473945" w:history="1">
         <w:r>
           <w:rPr>
             <w:rStyle w:val="Hyperlink"/>
@@ -1234,7 +1234,7 @@
             <w:noProof/>
             <w:webHidden/>
           </w:rPr>
-          <w:instrText xml:space="preserve"> PAGEREF _Toc242473769 \h </w:instrText>
+          <w:instrText xml:space="preserve"> PAGEREF _Toc242473945 \h </w:instrText>
         </w:r>
         <w:r>
           <w:rPr>
@@ -1282,7 +1282,7 @@
           <w14:ligatures w14:val="standardContextual"/>
         </w:rPr>
       </w:pPr>
-      <w:hyperlink w:anchor="_Toc242473770" w:history="1">
+      <w:hyperlink w:anchor="_Toc242473946" w:history="1">
         <w:r>
           <w:rPr>
             <w:rStyle w:val="Hyperlink"/>
@@ -1309,7 +1309,7 @@
             <w:noProof/>
             <w:webHidden/>
           </w:rPr>
-          <w:instrText xml:space="preserve"> PAGEREF _Toc242473770 \h </w:instrText>
+          <w:instrText xml:space="preserve"> PAGEREF _Toc242473946 \h </w:instrText>
         </w:r>
         <w:r>
           <w:rPr>
@@ -1357,7 +1357,7 @@
           <w14:ligatures w14:val="standardContextual"/>
         </w:rPr>
       </w:pPr>
-      <w:hyperlink w:anchor="_Toc242473771" w:history="1">
+      <w:hyperlink w:anchor="_Toc242473947" w:history="1">
         <w:r>
           <w:rPr>
             <w:rStyle w:val="Hyperlink"/>
@@ -1384,7 +1384,7 @@
             <w:noProof/>
             <w:webHidden/>
           </w:rPr>
-          <w:instrText xml:space="preserve"> PAGEREF _Toc242473771 \h </w:instrText>
+          <w:instrText xml:space="preserve"> PAGEREF _Toc242473947 \h </w:instrText>
         </w:r>
         <w:r>
           <w:rPr>
@@ -1432,7 +1432,7 @@
           <w14:ligatures w14:val="standardContextual"/>
         </w:rPr>
       </w:pPr>
-      <w:hyperlink w:anchor="_Toc242473772" w:history="1">
+      <w:hyperlink w:anchor="_Toc242473948" w:history="1">
         <w:r>
           <w:rPr>
             <w:rStyle w:val="Hyperlink"/>
@@ -1459,7 +1459,7 @@
             <w:noProof/>
             <w:webHidden/>
           </w:rPr>
-          <w:instrText xml:space="preserve"> PAGEREF _Toc242473772 \h </w:instrText>
+          <w:instrText xml:space="preserve"> PAGEREF _Toc242473948 \h </w:instrText>
         </w:r>
         <w:r>
           <w:rPr>
@@ -1507,7 +1507,7 @@
           <w14:ligatures w14:val="standardContextual"/>
         </w:rPr>
       </w:pPr>
-      <w:hyperlink w:anchor="_Toc242473773" w:history="1">
+      <w:hyperlink w:anchor="_Toc242473949" w:history="1">
         <w:r>
           <w:rPr>
             <w:rStyle w:val="Hyperlink"/>
@@ -1534,7 +1534,7 @@
             <w:noProof/>
             <w:webHidden/>
           </w:rPr>
-          <w:instrText xml:space="preserve"> PAGEREF _Toc242473773 \h </w:instrText>
+          <w:instrText xml:space="preserve"> PAGEREF _Toc242473949 \h </w:instrText>
         </w:r>
         <w:r>
           <w:rPr>
@@ -1582,7 +1582,7 @@
           <w14:ligatures w14:val="standardContextual"/>
         </w:rPr>
       </w:pPr>
-      <w:hyperlink w:anchor="_Toc242473774" w:history="1">
+      <w:hyperlink w:anchor="_Toc242473950" w:history="1">
         <w:r>
           <w:rPr>
             <w:rStyle w:val="Hyperlink"/>
@@ -1609,7 +1609,7 @@
             <w:noProof/>
             <w:webHidden/>
           </w:rPr>
-          <w:instrText xml:space="preserve"> PAGEREF _Toc242473774 \h </w:instrText>
+          <w:instrText xml:space="preserve"> PAGEREF _Toc242473950 \h </w:instrText>
         </w:r>
         <w:r>
           <w:rPr>
@@ -1657,7 +1657,7 @@
           <w14:ligatures w14:val="standardContextual"/>
         </w:rPr>
       </w:pPr>
-      <w:hyperlink w:anchor="_Toc242473775" w:history="1">
+      <w:hyperlink w:anchor="_Toc242473951" w:history="1">
         <w:r>
           <w:rPr>
             <w:rStyle w:val="Hyperlink"/>
@@ -1684,7 +1684,7 @@
             <w:noProof/>
             <w:webHidden/>
           </w:rPr>
-          <w:instrText xml:space="preserve"> PAGEREF _Toc242473775 \h </w:instrText>
+          <w:instrText xml:space="preserve"> PAGEREF _Toc242473951 \h </w:instrText>
         </w:r>
         <w:r>
           <w:rPr>
@@ -1732,7 +1732,7 @@
           <w14:ligatures w14:val="standardContextual"/>
         </w:rPr>
       </w:pPr>
-      <w:hyperlink w:anchor="_Toc242473776" w:history="1">
+      <w:hyperlink w:anchor="_Toc242473952" w:history="1">
         <w:r>
           <w:rPr>
             <w:rStyle w:val="Hyperlink"/>
@@ -1759,7 +1759,7 @@
             <w:noProof/>
             <w:webHidden/>
           </w:rPr>
-          <w:instrText xml:space="preserve"> PAGEREF _Toc242473776 \h </w:instrText>
+          <w:instrText xml:space="preserve"> PAGEREF _Toc242473952 \h </w:instrText>
         </w:r>
         <w:r>
           <w:rPr>
@@ -1807,7 +1807,7 @@
           <w14:ligatures w14:val="standardContextual"/>
         </w:rPr>
       </w:pPr>
-      <w:hyperlink w:anchor="_Toc242473777" w:history="1">
+      <w:hyperlink w:anchor="_Toc242473953" w:history="1">
         <w:r>
           <w:rPr>
             <w:rStyle w:val="Hyperlink"/>
@@ -1834,7 +1834,7 @@
             <w:noProof/>
             <w:webHidden/>
           </w:rPr>
-          <w:instrText xml:space="preserve"> PAGEREF _Toc242473777 \h </w:instrText>
+          <w:instrText xml:space="preserve"> PAGEREF _Toc242473953 \h </w:instrText>
         </w:r>
         <w:r>
           <w:rPr>
@@ -1882,7 +1882,7 @@
           <w14:ligatures w14:val="standardContextual"/>
         </w:rPr>
       </w:pPr>
-      <w:hyperlink w:anchor="_Toc242473778" w:history="1">
+      <w:hyperlink w:anchor="_Toc242473954" w:history="1">
         <w:r>
           <w:rPr>
             <w:rStyle w:val="Hyperlink"/>
@@ -1909,7 +1909,7 @@
             <w:noProof/>
             <w:webHidden/>
           </w:rPr>
-          <w:instrText xml:space="preserve"> PAGEREF _Toc242473778 \h </w:instrText>
+          <w:instrText xml:space="preserve"> PAGEREF _Toc242473954 \h </w:instrText>
         </w:r>
         <w:r>
           <w:rPr>
@@ -1957,7 +1957,7 @@
           <w14:ligatures w14:val="standardContextual"/>
         </w:rPr>
       </w:pPr>
-      <w:hyperlink w:anchor="_Toc242473779" w:history="1">
+      <w:hyperlink w:anchor="_Toc242473955" w:history="1">
         <w:r>
           <w:rPr>
             <w:rStyle w:val="Hyperlink"/>
@@ -1984,7 +1984,7 @@
             <w:noProof/>
             <w:webHidden/>
           </w:rPr>
-          <w:instrText xml:space="preserve"> PAGEREF _Toc242473779 \h </w:instrText>
+          <w:instrText xml:space="preserve"> PAGEREF _Toc242473955 \h </w:instrText>
         </w:r>
         <w:r>
           <w:rPr>
@@ -2032,7 +2032,7 @@
           <w14:ligatures w14:val="standardContextual"/>
         </w:rPr>
       </w:pPr>
-      <w:hyperlink w:anchor="_Toc242473780" w:history="1">
+      <w:hyperlink w:anchor="_Toc242473956" w:history="1">
         <w:r>
           <w:rPr>
             <w:rStyle w:val="Hyperlink"/>
@@ -2059,7 +2059,7 @@
             <w:noProof/>
             <w:webHidden/>
           </w:rPr>
-          <w:instrText xml:space="preserve"> PAGEREF _Toc242473780 \h </w:instrText>
+          <w:instrText xml:space="preserve"> PAGEREF _Toc242473956 \h </w:instrText>
         </w:r>
         <w:r>
           <w:rPr>
@@ -2107,7 +2107,7 @@
           <w14:ligatures w14:val="standardContextual"/>
         </w:rPr>
       </w:pPr>
-      <w:hyperlink w:anchor="_Toc242473781" w:history="1">
+      <w:hyperlink w:anchor="_Toc242473957" w:history="1">
         <w:r>
           <w:rPr>
             <w:rStyle w:val="Hyperlink"/>
@@ -2134,7 +2134,7 @@
             <w:noProof/>
             <w:webHidden/>
           </w:rPr>
-          <w:instrText xml:space="preserve"> PAGEREF _Toc242473781 \h </w:instrText>
+          <w:instrText xml:space="preserve"> PAGEREF _Toc242473957 \h </w:instrText>
         </w:r>
         <w:r>
           <w:rPr>
@@ -2182,7 +2182,7 @@
           <w14:ligatures w14:val="standardContextual"/>
         </w:rPr>
       </w:pPr>
-      <w:hyperlink w:anchor="_Toc242473782" w:history="1">
+      <w:hyperlink w:anchor="_Toc242473958" w:history="1">
         <w:r>
           <w:rPr>
             <w:rStyle w:val="Hyperlink"/>
@@ -2209,7 +2209,7 @@
             <w:noProof/>
             <w:webHidden/>
           </w:rPr>
-          <w:instrText xml:space="preserve"> PAGEREF _Toc242473782 \h </w:instrText>
+          <w:instrText xml:space="preserve"> PAGEREF _Toc242473958 \h </w:instrText>
         </w:r>
         <w:r>
           <w:rPr>
@@ -2257,7 +2257,7 @@
           <w14:ligatures w14:val="standardContextual"/>
         </w:rPr>
       </w:pPr>
-      <w:hyperlink w:anchor="_Toc242473783" w:history="1">
+      <w:hyperlink w:anchor="_Toc242473959" w:history="1">
         <w:r>
           <w:rPr>
             <w:rStyle w:val="Hyperlink"/>
@@ -2284,7 +2284,7 @@
             <w:noProof/>
             <w:webHidden/>
           </w:rPr>
-          <w:instrText xml:space="preserve"> PAGEREF _Toc242473783 \h </w:instrText>
+          <w:instrText xml:space="preserve"> PAGEREF _Toc242473959 \h </w:instrText>
         </w:r>
         <w:r>
           <w:rPr>
@@ -2332,7 +2332,7 @@
           <w14:ligatures w14:val="standardContextual"/>
         </w:rPr>
       </w:pPr>
-      <w:hyperlink w:anchor="_Toc242473784" w:history="1">
+      <w:hyperlink w:anchor="_Toc242473960" w:history="1">
         <w:r>
           <w:rPr>
             <w:rStyle w:val="Hyperlink"/>
@@ -2359,7 +2359,7 @@
             <w:noProof/>
             <w:webHidden/>
           </w:rPr>
-          <w:instrText xml:space="preserve"> PAGEREF _Toc242473784 \h </w:instrText>
+          <w:instrText xml:space="preserve"> PAGEREF _Toc242473960 \h </w:instrText>
         </w:r>
         <w:r>
           <w:rPr>
@@ -2407,7 +2407,7 @@
           <w14:ligatures w14:val="standardContextual"/>
         </w:rPr>
       </w:pPr>
-      <w:hyperlink w:anchor="_Toc242473785" w:history="1">
+      <w:hyperlink w:anchor="_Toc242473961" w:history="1">
         <w:r>
           <w:rPr>
             <w:rStyle w:val="Hyperlink"/>
@@ -2434,7 +2434,7 @@
             <w:noProof/>
             <w:webHidden/>
           </w:rPr>
-          <w:instrText xml:space="preserve"> PAGEREF _Toc242473785 \h </w:instrText>
+          <w:instrText xml:space="preserve"> PAGEREF _Toc242473961 \h </w:instrText>
         </w:r>
         <w:r>
           <w:rPr>
@@ -2482,7 +2482,7 @@
           <w14:ligatures w14:val="standardContextual"/>
         </w:rPr>
       </w:pPr>
-      <w:hyperlink w:anchor="_Toc242473786" w:history="1">
+      <w:hyperlink w:anchor="_Toc242473962" w:history="1">
         <w:r>
           <w:rPr>
             <w:rStyle w:val="Hyperlink"/>
@@ -2509,7 +2509,7 @@
             <w:noProof/>
             <w:webHidden/>
           </w:rPr>
-          <w:instrText xml:space="preserve"> PAGEREF _Toc242473786 \h </w:instrText>
+          <w:instrText xml:space="preserve"> PAGEREF _Toc242473962 \h </w:instrText>
         </w:r>
         <w:r>
           <w:rPr>
@@ -2557,7 +2557,7 @@
           <w14:ligatures w14:val="standardContextual"/>
         </w:rPr>
       </w:pPr>
-      <w:hyperlink w:anchor="_Toc242473787" w:history="1">
+      <w:hyperlink w:anchor="_Toc242473963" w:history="1">
         <w:r>
           <w:rPr>
             <w:rStyle w:val="Hyperlink"/>
@@ -2584,7 +2584,7 @@
             <w:noProof/>
             <w:webHidden/>
           </w:rPr>
-          <w:instrText xml:space="preserve"> PAGEREF _Toc242473787 \h </w:instrText>
+          <w:instrText xml:space="preserve"> PAGEREF _Toc242473963 \h </w:instrText>
         </w:r>
         <w:r>
           <w:rPr>
@@ -2632,7 +2632,7 @@
           <w14:ligatures w14:val="standardContextual"/>
         </w:rPr>
       </w:pPr>
-      <w:hyperlink w:anchor="_Toc242473788" w:history="1">
+      <w:hyperlink w:anchor="_Toc242473964" w:history="1">
         <w:r>
           <w:rPr>
             <w:rStyle w:val="Hyperlink"/>
@@ -2659,7 +2659,7 @@
             <w:noProof/>
             <w:webHidden/>
           </w:rPr>
-          <w:instrText xml:space="preserve"> PAGEREF _Toc242473788 \h </w:instrText>
+          <w:instrText xml:space="preserve"> PAGEREF _Toc242473964 \h </w:instrText>
         </w:r>
         <w:r>
           <w:rPr>
@@ -2707,7 +2707,7 @@
           <w14:ligatures w14:val="standardContextual"/>
         </w:rPr>
       </w:pPr>
-      <w:hyperlink w:anchor="_Toc242473789" w:history="1">
+      <w:hyperlink w:anchor="_Toc242473965" w:history="1">
         <w:r>
           <w:rPr>
             <w:rStyle w:val="Hyperlink"/>
@@ -2734,7 +2734,7 @@
             <w:noProof/>
             <w:webHidden/>
           </w:rPr>
-          <w:instrText xml:space="preserve"> PAGEREF _Toc242473789 \h </w:instrText>
+          <w:instrText xml:space="preserve"> PAGEREF _Toc242473965 \h </w:instrText>
         </w:r>
         <w:r>
           <w:rPr>
@@ -2782,7 +2782,7 @@
           <w14:ligatures w14:val="standardContextual"/>
         </w:rPr>
       </w:pPr>
-      <w:hyperlink w:anchor="_Toc242473790" w:history="1">
+      <w:hyperlink w:anchor="_Toc242473966" w:history="1">
         <w:r>
           <w:rPr>
             <w:rStyle w:val="Hyperlink"/>
@@ -2809,7 +2809,7 @@
             <w:noProof/>
             <w:webHidden/>
           </w:rPr>
-          <w:instrText xml:space="preserve"> PAGEREF _Toc242473790 \h </w:instrText>
+          <w:instrText xml:space="preserve"> PAGEREF _Toc242473966 \h </w:instrText>
         </w:r>
         <w:r>
           <w:rPr>
@@ -2857,7 +2857,7 @@
           <w14:ligatures w14:val="standardContextual"/>
         </w:rPr>
       </w:pPr>
-      <w:hyperlink w:anchor="_Toc242473791" w:history="1">
+      <w:hyperlink w:anchor="_Toc242473967" w:history="1">
         <w:r>
           <w:rPr>
             <w:rStyle w:val="Hyperlink"/>
@@ -2884,7 +2884,7 @@
             <w:noProof/>
             <w:webHidden/>
           </w:rPr>
-          <w:instrText xml:space="preserve"> PAGEREF _Toc242473791 \h </w:instrText>
+          <w:instrText xml:space="preserve"> PAGEREF _Toc242473967 \h </w:instrText>
         </w:r>
         <w:r>
           <w:rPr>
@@ -2932,7 +2932,7 @@
           <w14:ligatures w14:val="standardContextual"/>
         </w:rPr>
       </w:pPr>
-      <w:hyperlink w:anchor="_Toc242473792" w:history="1">
+      <w:hyperlink w:anchor="_Toc242473968" w:history="1">
         <w:r>
           <w:rPr>
             <w:rStyle w:val="Hyperlink"/>
@@ -2959,7 +2959,7 @@
             <w:noProof/>
             <w:webHidden/>
           </w:rPr>
-          <w:instrText xml:space="preserve"> PAGEREF _Toc242473792 \h </w:instrText>
+          <w:instrText xml:space="preserve"> PAGEREF _Toc242473968 \h </w:instrText>
         </w:r>
         <w:r>
           <w:rPr>
@@ -3007,7 +3007,7 @@
           <w14:ligatures w14:val="standardContextual"/>
         </w:rPr>
       </w:pPr>
-      <w:hyperlink w:anchor="_Toc242473793" w:history="1">
+      <w:hyperlink w:anchor="_Toc242473969" w:history="1">
         <w:r>
           <w:rPr>
             <w:rStyle w:val="Hyperlink"/>
@@ -3034,7 +3034,7 @@
             <w:noProof/>
             <w:webHidden/>
           </w:rPr>
-          <w:instrText xml:space="preserve"> PAGEREF _Toc242473793 \h </w:instrText>
+          <w:instrText xml:space="preserve"> PAGEREF _Toc242473969 \h </w:instrText>
         </w:r>
         <w:r>
           <w:rPr>
@@ -3082,7 +3082,7 @@
           <w14:ligatures w14:val="standardContextual"/>
         </w:rPr>
       </w:pPr>
-      <w:hyperlink w:anchor="_Toc242473794" w:history="1">
+      <w:hyperlink w:anchor="_Toc242473970" w:history="1">
         <w:r>
           <w:rPr>
             <w:rStyle w:val="Hyperlink"/>
@@ -3109,7 +3109,7 @@
             <w:noProof/>
             <w:webHidden/>
           </w:rPr>
-          <w:instrText xml:space="preserve"> PAGEREF _Toc242473794 \h </w:instrText>
+          <w:instrText xml:space="preserve"> PAGEREF _Toc242473970 \h </w:instrText>
         </w:r>
         <w:r>
           <w:rPr>
@@ -3157,7 +3157,7 @@
           <w14:ligatures w14:val="standardContextual"/>
         </w:rPr>
       </w:pPr>
-      <w:hyperlink w:anchor="_Toc242473795" w:history="1">
+      <w:hyperlink w:anchor="_Toc242473971" w:history="1">
         <w:r>
           <w:rPr>
             <w:rStyle w:val="Hyperlink"/>
@@ -3184,7 +3184,7 @@
             <w:noProof/>
             <w:webHidden/>
           </w:rPr>
-          <w:instrText xml:space="preserve"> PAGEREF _Toc242473795 \h </w:instrText>
+          <w:instrText xml:space="preserve"> PAGEREF _Toc242473971 \h </w:instrText>
         </w:r>
         <w:r>
           <w:rPr>
@@ -3232,7 +3232,7 @@
           <w14:ligatures w14:val="standardContextual"/>
         </w:rPr>
       </w:pPr>
-      <w:hyperlink w:anchor="_Toc242473796" w:history="1">
+      <w:hyperlink w:anchor="_Toc242473972" w:history="1">
         <w:r>
           <w:rPr>
             <w:rStyle w:val="Hyperlink"/>
@@ -3259,7 +3259,7 @@
             <w:noProof/>
             <w:webHidden/>
           </w:rPr>
-          <w:instrText xml:space="preserve"> PAGEREF _Toc242473796 \h </w:instrText>
+          <w:instrText xml:space="preserve"> PAGEREF _Toc242473972 \h </w:instrText>
         </w:r>
         <w:r>
           <w:rPr>
@@ -3307,7 +3307,7 @@
           <w14:ligatures w14:val="standardContextual"/>
         </w:rPr>
       </w:pPr>
-      <w:hyperlink w:anchor="_Toc242473797" w:history="1">
+      <w:hyperlink w:anchor="_Toc242473973" w:history="1">
         <w:r>
           <w:rPr>
             <w:rStyle w:val="Hyperlink"/>
@@ -3334,7 +3334,7 @@
             <w:noProof/>
             <w:webHidden/>
           </w:rPr>
-          <w:instrText xml:space="preserve"> PAGEREF _Toc242473797 \h </w:instrText>
+          <w:instrText xml:space="preserve"> PAGEREF _Toc242473973 \h </w:instrText>
         </w:r>
         <w:r>
           <w:rPr>
@@ -3382,7 +3382,7 @@
           <w14:ligatures w14:val="standardContextual"/>
         </w:rPr>
       </w:pPr>
-      <w:hyperlink w:anchor="_Toc242473798" w:history="1">
+      <w:hyperlink w:anchor="_Toc242473974" w:history="1">
         <w:r>
           <w:rPr>
             <w:rStyle w:val="Hyperlink"/>
@@ -3409,7 +3409,7 @@
             <w:noProof/>
             <w:webHidden/>
           </w:rPr>
-          <w:instrText xml:space="preserve"> PAGEREF _Toc242473798 \h </w:instrText>
+          <w:instrText xml:space="preserve"> PAGEREF _Toc242473974 \h </w:instrText>
         </w:r>
         <w:r>
           <w:rPr>
@@ -3457,7 +3457,7 @@
           <w14:ligatures w14:val="standardContextual"/>
         </w:rPr>
       </w:pPr>
-      <w:hyperlink w:anchor="_Toc242473799" w:history="1">
+      <w:hyperlink w:anchor="_Toc242473975" w:history="1">
         <w:r>
           <w:rPr>
             <w:rStyle w:val="Hyperlink"/>
@@ -3484,7 +3484,7 @@
             <w:noProof/>
             <w:webHidden/>
           </w:rPr>
-          <w:instrText xml:space="preserve"> PAGEREF _Toc242473799 \h </w:instrText>
+          <w:instrText xml:space="preserve"> PAGEREF _Toc242473975 \h </w:instrText>
         </w:r>
         <w:r>
           <w:rPr>
@@ -3532,7 +3532,7 @@
           <w14:ligatures w14:val="standardContextual"/>
         </w:rPr>
       </w:pPr>
-      <w:hyperlink w:anchor="_Toc242473800" w:history="1">
+      <w:hyperlink w:anchor="_Toc242473976" w:history="1">
         <w:r>
           <w:rPr>
             <w:rStyle w:val="Hyperlink"/>
@@ -3559,7 +3559,7 @@
             <w:noProof/>
             <w:webHidden/>
           </w:rPr>
-          <w:instrText xml:space="preserve"> PAGEREF _Toc242473800 \h </w:instrText>
+          <w:instrText xml:space="preserve"> PAGEREF _Toc242473976 \h </w:instrText>
         </w:r>
         <w:r>
           <w:rPr>
@@ -3607,7 +3607,7 @@
           <w14:ligatures w14:val="standardContextual"/>
         </w:rPr>
       </w:pPr>
-      <w:hyperlink w:anchor="_Toc242473801" w:history="1">
+      <w:hyperlink w:anchor="_Toc242473977" w:history="1">
         <w:r>
           <w:rPr>
             <w:rStyle w:val="Hyperlink"/>
@@ -3634,7 +3634,7 @@
             <w:noProof/>
             <w:webHidden/>
           </w:rPr>
-          <w:instrText xml:space="preserve"> PAGEREF _Toc242473801 \h </w:instrText>
+          <w:instrText xml:space="preserve"> PAGEREF _Toc242473977 \h </w:instrText>
         </w:r>
         <w:r>
           <w:rPr>
@@ -3675,7 +3675,7 @@
         <w:pStyle w:val="Heading1"/>
         <w:pageBreakBefore/>
       </w:pPr>
-      <w:bookmarkStart w:id="0" w:name="_Toc242473760"/>
+      <w:bookmarkStart w:id="0" w:name="_Toc242473936"/>
       <w:r>
         <w:t>1 Introducción</w:t>
       </w:r>
@@ -3685,7 +3685,7 @@
       <w:pPr>
         <w:pStyle w:val="Heading2"/>
       </w:pPr>
-      <w:bookmarkStart w:id="1" w:name="_Toc242473761"/>
+      <w:bookmarkStart w:id="1" w:name="_Toc242473937"/>
       <w:r>
         <w:t>1.1 Propósito y alcance</w:t>
       </w:r>
@@ -4039,7 +4039,7 @@
       <w:pPr>
         <w:pStyle w:val="Heading2"/>
       </w:pPr>
-      <w:bookmarkStart w:id="2" w:name="_Toc242473762"/>
+      <w:bookmarkStart w:id="2" w:name="_Toc242473938"/>
       <w:r>
         <w:t>1.2 Mapa de servicios</w:t>
       </w:r>
@@ -4499,7 +4499,7 @@
       <w:pPr>
         <w:pStyle w:val="Heading2"/>
       </w:pPr>
-      <w:bookmarkStart w:id="3" w:name="_Toc242473763"/>
+      <w:bookmarkStart w:id="3" w:name="_Toc242473939"/>
       <w:r>
         <w:t>1.3 Cómo leer este documento</w:t>
       </w:r>
@@ -4565,7 +4565,7 @@
       <w:pPr>
         <w:pStyle w:val="Heading2"/>
       </w:pPr>
-      <w:bookmarkStart w:id="4" w:name="_Toc242473764"/>
+      <w:bookmarkStart w:id="4" w:name="_Toc242473940"/>
       <w:r>
         <w:t>1.4 Relación con otros entregables</w:t>
       </w:r>
@@ -4573,7 +4573,10 @@
     </w:p>
     <w:p>
       <w:r>
-        <w:t xml:space="preserve">Este documento es el entregable 5. El diagrama de componentes es el entregable 4. Los diagramas, los registros de decisión de arquitectura (ADR, </w:t>
+        <w:t>Este documento es el entregable 5. El diagrama de componentes es el entregable 4 y representa la arquitectura deseada, el objetivo hacia el que evoluciona el sistema. Difiere del estado actual en tres puntos: Donaciones todavía guarda en memoria, solo Incentivos usa el almacenamiento de objetos y los medios de notificación se simulan dentro del servicio en lugar de llamarse por HTTP. Este documento describe el estado actual; la Figura 1 lo resume. Los diagramas, los registros de decisión de arquitectura (AD</w:t>
+      </w:r>
+      <w:r>
+        <w:t xml:space="preserve">R, </w:t>
       </w:r>
       <w:r>
         <w:rPr>
@@ -4589,7 +4592,7 @@
       <w:pPr>
         <w:pStyle w:val="Heading1"/>
       </w:pPr>
-      <w:bookmarkStart w:id="5" w:name="_Toc242473765"/>
+      <w:bookmarkStart w:id="5" w:name="_Toc242473941"/>
       <w:r>
         <w:t>2 Atributos de calidad</w:t>
       </w:r>
@@ -5152,7 +5155,7 @@
       <w:pPr>
         <w:pStyle w:val="Heading1"/>
       </w:pPr>
-      <w:bookmarkStart w:id="6" w:name="_Toc242473766"/>
+      <w:bookmarkStart w:id="6" w:name="_Toc242473942"/>
       <w:r>
         <w:t>3 Arquitectura orientada a servicios (microservicios)</w:t>
       </w:r>
@@ -5162,7 +5165,7 @@
       <w:pPr>
         <w:pStyle w:val="Heading2"/>
       </w:pPr>
-      <w:bookmarkStart w:id="7" w:name="_Toc242473767"/>
+      <w:bookmarkStart w:id="7" w:name="_Toc242473943"/>
       <w:r>
         <w:t>3.1 Definición operativa</w:t>
       </w:r>
@@ -5240,7 +5243,7 @@
       <w:pPr>
         <w:pStyle w:val="Heading2"/>
       </w:pPr>
-      <w:bookmarkStart w:id="8" w:name="_Toc242473768"/>
+      <w:bookmarkStart w:id="8" w:name="_Toc242473944"/>
       <w:r>
         <w:t>3.2 Regla de comunicación</w:t>
       </w:r>
@@ -5265,7 +5268,7 @@
           <w:noProof/>
         </w:rPr>
         <w:drawing>
-          <wp:inline distT="0" distB="0" distL="0" distR="0" wp14:anchorId="79E303D5" wp14:editId="1516FA31">
+          <wp:inline distT="0" distB="0" distL="0" distR="0" wp14:anchorId="581116C2" wp14:editId="22A2F435">
             <wp:extent cx="3957534" cy="6176712"/>
             <wp:effectExtent l="0" t="0" r="0" b="0"/>
             <wp:docPr id="1" name="Picture 1"/>
@@ -5321,7 +5324,7 @@
       <w:pPr>
         <w:pStyle w:val="Heading2"/>
       </w:pPr>
-      <w:bookmarkStart w:id="9" w:name="_Toc242473769"/>
+      <w:bookmarkStart w:id="9" w:name="_Toc242473945"/>
       <w:r>
         <w:t>3.3 Infraestructura y núcleo compartidos</w:t>
       </w:r>
@@ -5363,7 +5366,7 @@
       <w:pPr>
         <w:pStyle w:val="Heading2"/>
       </w:pPr>
-      <w:bookmarkStart w:id="10" w:name="_Toc242473770"/>
+      <w:bookmarkStart w:id="10" w:name="_Toc242473946"/>
       <w:r>
         <w:t>3.4 Decisión de estilo</w:t>
       </w:r>
@@ -5710,7 +5713,7 @@
       <w:pPr>
         <w:pStyle w:val="Heading1"/>
       </w:pPr>
-      <w:bookmarkStart w:id="11" w:name="_Toc242473771"/>
+      <w:bookmarkStart w:id="11" w:name="_Toc242473947"/>
       <w:r>
         <w:t>4 Capas e inversión de dependencias</w:t>
       </w:r>
@@ -5720,7 +5723,7 @@
       <w:pPr>
         <w:pStyle w:val="Heading2"/>
       </w:pPr>
-      <w:bookmarkStart w:id="12" w:name="_Toc242473772"/>
+      <w:bookmarkStart w:id="12" w:name="_Toc242473948"/>
       <w:r>
         <w:t>4.1 Capas</w:t>
       </w:r>
@@ -5810,7 +5813,7 @@
           <w:noProof/>
         </w:rPr>
         <w:drawing>
-          <wp:inline distT="0" distB="0" distL="0" distR="0" wp14:anchorId="2D88EE5D" wp14:editId="792D20FA">
+          <wp:inline distT="0" distB="0" distL="0" distR="0" wp14:anchorId="607F6606" wp14:editId="1279ED0B">
             <wp:extent cx="4393972" cy="4882191"/>
             <wp:effectExtent l="0" t="0" r="0" b="0"/>
             <wp:docPr id="2" name="Picture 2"/>
@@ -5866,7 +5869,7 @@
       <w:pPr>
         <w:pStyle w:val="Heading2"/>
       </w:pPr>
-      <w:bookmarkStart w:id="13" w:name="_Toc242473773"/>
+      <w:bookmarkStart w:id="13" w:name="_Toc242473949"/>
       <w:r>
         <w:t>4.2 Regla de dependencia y composición</w:t>
       </w:r>
@@ -5893,7 +5896,7 @@
       <w:pPr>
         <w:pStyle w:val="Heading2"/>
       </w:pPr>
-      <w:bookmarkStart w:id="14" w:name="_Toc242473774"/>
+      <w:bookmarkStart w:id="14" w:name="_Toc242473950"/>
       <w:r>
         <w:t>4.3 Decisión de organización interna</w:t>
       </w:r>
@@ -6259,7 +6262,7 @@
       <w:pPr>
         <w:pStyle w:val="Heading1"/>
       </w:pPr>
-      <w:bookmarkStart w:id="15" w:name="_Toc242473775"/>
+      <w:bookmarkStart w:id="15" w:name="_Toc242473951"/>
       <w:r>
         <w:t>5 Principios SOLID y patrones de diseño</w:t>
       </w:r>
@@ -6269,7 +6272,7 @@
       <w:pPr>
         <w:pStyle w:val="Heading2"/>
       </w:pPr>
-      <w:bookmarkStart w:id="16" w:name="_Toc242473776"/>
+      <w:bookmarkStart w:id="16" w:name="_Toc242473952"/>
       <w:r>
         <w:t>5.1 Principios</w:t>
       </w:r>
@@ -6356,7 +6359,7 @@
       <w:pPr>
         <w:pStyle w:val="Heading2"/>
       </w:pPr>
-      <w:bookmarkStart w:id="17" w:name="_Toc242473777"/>
+      <w:bookmarkStart w:id="17" w:name="_Toc242473953"/>
       <w:r>
         <w:t>5.2 Patrones</w:t>
       </w:r>
@@ -7015,7 +7018,7 @@
       <w:pPr>
         <w:pStyle w:val="Heading1"/>
       </w:pPr>
-      <w:bookmarkStart w:id="18" w:name="_Toc242473778"/>
+      <w:bookmarkStart w:id="18" w:name="_Toc242473954"/>
       <w:r>
         <w:t>6 Estrategia de integración</w:t>
       </w:r>
@@ -7025,7 +7028,7 @@
       <w:pPr>
         <w:pStyle w:val="Heading2"/>
       </w:pPr>
-      <w:bookmarkStart w:id="19" w:name="_Toc242473779"/>
+      <w:bookmarkStart w:id="19" w:name="_Toc242473955"/>
       <w:r>
         <w:t>6.1 Mapa de comunicación</w:t>
       </w:r>
@@ -7530,7 +7533,7 @@
       <w:pPr>
         <w:pStyle w:val="Heading2"/>
       </w:pPr>
-      <w:bookmarkStart w:id="20" w:name="_Toc242473780"/>
+      <w:bookmarkStart w:id="20" w:name="_Toc242473956"/>
       <w:r>
         <w:t>6.2 Cola hacia Notificaciones</w:t>
       </w:r>
@@ -7939,7 +7942,7 @@
       <w:pPr>
         <w:pStyle w:val="Heading2"/>
       </w:pPr>
-      <w:bookmarkStart w:id="21" w:name="_Toc242473781"/>
+      <w:bookmarkStart w:id="21" w:name="_Toc242473957"/>
       <w:r>
         <w:t>6.3 Broker de integración con logística</w:t>
       </w:r>
@@ -8070,7 +8073,7 @@
           <w:noProof/>
         </w:rPr>
         <w:drawing>
-          <wp:inline distT="0" distB="0" distL="0" distR="0" wp14:anchorId="535703B1" wp14:editId="4C35744B">
+          <wp:inline distT="0" distB="0" distL="0" distR="0" wp14:anchorId="6A8771F2" wp14:editId="692B3E88">
             <wp:extent cx="5032103" cy="7199999"/>
             <wp:effectExtent l="0" t="0" r="0" b="0"/>
             <wp:docPr id="3" name="Picture 3"/>
@@ -8483,7 +8486,7 @@
       <w:pPr>
         <w:pStyle w:val="Heading2"/>
       </w:pPr>
-      <w:bookmarkStart w:id="22" w:name="_Toc242473782"/>
+      <w:bookmarkStart w:id="22" w:name="_Toc242473958"/>
       <w:r>
         <w:t>6.4 Vuelta del estado</w:t>
       </w:r>
@@ -8843,7 +8846,7 @@
       <w:pPr>
         <w:pStyle w:val="Heading2"/>
       </w:pPr>
-      <w:bookmarkStart w:id="23" w:name="_Toc242473783"/>
+      <w:bookmarkStart w:id="23" w:name="_Toc242473959"/>
       <w:r>
         <w:t>6.5 Restricciones heredadas de la Entrega 3</w:t>
       </w:r>
@@ -9095,7 +9098,7 @@
       <w:pPr>
         <w:pStyle w:val="Heading1"/>
       </w:pPr>
-      <w:bookmarkStart w:id="24" w:name="_Toc242473784"/>
+      <w:bookmarkStart w:id="24" w:name="_Toc242473960"/>
       <w:r>
         <w:t>7 Persistencia</w:t>
       </w:r>
@@ -9190,7 +9193,7 @@
           <w:noProof/>
         </w:rPr>
         <w:drawing>
-          <wp:inline distT="0" distB="0" distL="0" distR="0" wp14:anchorId="39BB36AA" wp14:editId="5E2CF44B">
+          <wp:inline distT="0" distB="0" distL="0" distR="0" wp14:anchorId="3B0ADDA5" wp14:editId="2AE5CE8C">
             <wp:extent cx="4948767" cy="4083288"/>
             <wp:effectExtent l="0" t="0" r="0" b="0"/>
             <wp:docPr id="4" name="Picture 4"/>
@@ -9992,7 +9995,7 @@
       <w:pPr>
         <w:pStyle w:val="Heading1"/>
       </w:pPr>
-      <w:bookmarkStart w:id="25" w:name="_Toc242473785"/>
+      <w:bookmarkStart w:id="25" w:name="_Toc242473961"/>
       <w:r>
         <w:t>8 Estrategia y tipos de pruebas</w:t>
       </w:r>
@@ -10849,7 +10852,7 @@
       <w:pPr>
         <w:pStyle w:val="Heading1"/>
       </w:pPr>
-      <w:bookmarkStart w:id="26" w:name="_Toc242473786"/>
+      <w:bookmarkStart w:id="26" w:name="_Toc242473962"/>
       <w:r>
         <w:t>9 Despliegue</w:t>
       </w:r>
@@ -10859,7 +10862,7 @@
       <w:pPr>
         <w:pStyle w:val="Heading2"/>
       </w:pPr>
-      <w:bookmarkStart w:id="27" w:name="_Toc242473787"/>
+      <w:bookmarkStart w:id="27" w:name="_Toc242473963"/>
       <w:r>
         <w:t>9.1 Contenedores</w:t>
       </w:r>
@@ -10926,7 +10929,7 @@
           <w:noProof/>
         </w:rPr>
         <w:drawing>
-          <wp:inline distT="0" distB="0" distL="0" distR="0" wp14:anchorId="7DA4C798" wp14:editId="358A1711">
+          <wp:inline distT="0" distB="0" distL="0" distR="0" wp14:anchorId="4D318EE6" wp14:editId="0143F6AF">
             <wp:extent cx="4253424" cy="3513698"/>
             <wp:effectExtent l="0" t="0" r="0" b="0"/>
             <wp:docPr id="5" name="Picture 5"/>
@@ -10982,7 +10985,7 @@
       <w:pPr>
         <w:pStyle w:val="Heading2"/>
       </w:pPr>
-      <w:bookmarkStart w:id="28" w:name="_Toc242473788"/>
+      <w:bookmarkStart w:id="28" w:name="_Toc242473964"/>
       <w:r>
         <w:t>9.2 Entornos</w:t>
       </w:r>
@@ -11275,7 +11278,7 @@
       <w:pPr>
         <w:pStyle w:val="Heading2"/>
       </w:pPr>
-      <w:bookmarkStart w:id="29" w:name="_Toc242473789"/>
+      <w:bookmarkStart w:id="29" w:name="_Toc242473965"/>
       <w:r>
         <w:t>9.3 Decisión de plataforma</w:t>
       </w:r>
@@ -11686,7 +11689,7 @@
       <w:pPr>
         <w:pStyle w:val="Heading1"/>
       </w:pPr>
-      <w:bookmarkStart w:id="30" w:name="_Toc242473790"/>
+      <w:bookmarkStart w:id="30" w:name="_Toc242473966"/>
       <w:r>
         <w:t>10 Decisiones diferidas y trade-offs asumidos</w:t>
       </w:r>
@@ -11696,7 +11699,7 @@
       <w:pPr>
         <w:pStyle w:val="Heading2"/>
       </w:pPr>
-      <w:bookmarkStart w:id="31" w:name="_Toc242473791"/>
+      <w:bookmarkStart w:id="31" w:name="_Toc242473967"/>
       <w:r>
         <w:t>10.1 Garantías que hoy no ofrecemos</w:t>
       </w:r>
@@ -11989,7 +11992,7 @@
       <w:pPr>
         <w:pStyle w:val="Heading2"/>
       </w:pPr>
-      <w:bookmarkStart w:id="32" w:name="_Toc242473792"/>
+      <w:bookmarkStart w:id="32" w:name="_Toc242473968"/>
       <w:r>
         <w:t>10.2 Deuda agrupada</w:t>
       </w:r>
@@ -12437,7 +12440,7 @@
         <w:pStyle w:val="Heading1"/>
         <w:pageBreakBefore/>
       </w:pPr>
-      <w:bookmarkStart w:id="33" w:name="_Toc242473793"/>
+      <w:bookmarkStart w:id="33" w:name="_Toc242473969"/>
       <w:r>
         <w:t>11 Cómo aplica la arquitectura cada servicio</w:t>
       </w:r>
@@ -12452,7 +12455,7 @@
       <w:pPr>
         <w:pStyle w:val="Heading2"/>
       </w:pPr>
-      <w:bookmarkStart w:id="34" w:name="_Toc242473794"/>
+      <w:bookmarkStart w:id="34" w:name="_Toc242473970"/>
       <w:r>
         <w:t>11.1 Donaciones</w:t>
       </w:r>
@@ -13212,7 +13215,7 @@
         <w:pStyle w:val="Heading2"/>
         <w:pageBreakBefore/>
       </w:pPr>
-      <w:bookmarkStart w:id="35" w:name="_Toc242473795"/>
+      <w:bookmarkStart w:id="35" w:name="_Toc242473971"/>
       <w:r>
         <w:t>11.2 Logística</w:t>
       </w:r>
@@ -13977,7 +13980,7 @@
         <w:pStyle w:val="Heading2"/>
         <w:pageBreakBefore/>
       </w:pPr>
-      <w:bookmarkStart w:id="36" w:name="_Toc242473796"/>
+      <w:bookmarkStart w:id="36" w:name="_Toc242473972"/>
       <w:r>
         <w:t>11.3 Notificaciones</w:t>
       </w:r>
@@ -14749,7 +14752,7 @@
         <w:pStyle w:val="Heading2"/>
         <w:pageBreakBefore/>
       </w:pPr>
-      <w:bookmarkStart w:id="37" w:name="_Toc242473797"/>
+      <w:bookmarkStart w:id="37" w:name="_Toc242473973"/>
       <w:r>
         <w:t>11.4 Incentivos</w:t>
       </w:r>
@@ -15501,7 +15504,7 @@
         <w:pStyle w:val="Heading1"/>
         <w:pageBreakBefore/>
       </w:pPr>
-      <w:bookmarkStart w:id="38" w:name="_Toc242473798"/>
+      <w:bookmarkStart w:id="38" w:name="_Toc242473974"/>
       <w:r>
         <w:t>Anexo A. Índice de decisiones</w:t>
       </w:r>
@@ -15949,7 +15952,7 @@
         <w:pStyle w:val="Heading1"/>
         <w:pageBreakBefore/>
       </w:pPr>
-      <w:bookmarkStart w:id="39" w:name="_Toc242473799"/>
+      <w:bookmarkStart w:id="39" w:name="_Toc242473975"/>
       <w:r>
         <w:t>Anexo B. Trazabilidad de requisitos</w:t>
       </w:r>
@@ -16228,7 +16231,7 @@
               <w:rPr>
                 <w:sz w:val="20"/>
               </w:rPr>
-              <w:t>Entregable 4 y Figura 1</w:t>
+              <w:t>Entregable 4 (arquitectura deseada) y Figura 1 (estado actual)</w:t>
             </w:r>
           </w:p>
         </w:tc>
@@ -16614,7 +16617,7 @@
         <w:pStyle w:val="Heading1"/>
         <w:pageBreakBefore/>
       </w:pPr>
-      <w:bookmarkStart w:id="40" w:name="_Toc242473800"/>
+      <w:bookmarkStart w:id="40" w:name="_Toc242473976"/>
       <w:r>
         <w:t>Anexo C. Deuda técnica</w:t>
       </w:r>
@@ -17751,7 +17754,7 @@
         <w:pStyle w:val="Heading1"/>
         <w:pageBreakBefore/>
       </w:pPr>
-      <w:bookmarkStart w:id="41" w:name="_Toc242473801"/>
+      <w:bookmarkStart w:id="41" w:name="_Toc242473977"/>
       <w:r>
         <w:t>Anexo D. Glosario y siglas</w:t>
       </w:r>
@@ -19415,31 +19418,31 @@
       </w:rPr>
     </w:lvl>
   </w:abstractNum>
-  <w:num w:numId="1" w16cid:durableId="1364289161">
+  <w:num w:numId="1" w16cid:durableId="387195297">
     <w:abstractNumId w:val="8"/>
   </w:num>
-  <w:num w:numId="2" w16cid:durableId="1480028403">
+  <w:num w:numId="2" w16cid:durableId="843057882">
     <w:abstractNumId w:val="6"/>
   </w:num>
-  <w:num w:numId="3" w16cid:durableId="63571710">
+  <w:num w:numId="3" w16cid:durableId="804391071">
     <w:abstractNumId w:val="5"/>
   </w:num>
-  <w:num w:numId="4" w16cid:durableId="468983793">
+  <w:num w:numId="4" w16cid:durableId="1341422965">
     <w:abstractNumId w:val="4"/>
   </w:num>
-  <w:num w:numId="5" w16cid:durableId="650867906">
+  <w:num w:numId="5" w16cid:durableId="986327319">
     <w:abstractNumId w:val="7"/>
   </w:num>
-  <w:num w:numId="6" w16cid:durableId="559825300">
+  <w:num w:numId="6" w16cid:durableId="1881093401">
     <w:abstractNumId w:val="3"/>
   </w:num>
-  <w:num w:numId="7" w16cid:durableId="312219916">
+  <w:num w:numId="7" w16cid:durableId="1362245916">
     <w:abstractNumId w:val="2"/>
   </w:num>
-  <w:num w:numId="8" w16cid:durableId="1419864417">
+  <w:num w:numId="8" w16cid:durableId="867983676">
     <w:abstractNumId w:val="1"/>
   </w:num>
-  <w:num w:numId="9" w16cid:durableId="777677059">
+  <w:num w:numId="9" w16cid:durableId="31539127">
     <w:abstractNumId w:val="0"/>
   </w:num>
 </w:numbering>
@@ -30828,7 +30831,7 @@
     <w:autoRedefine/>
     <w:uiPriority w:val="39"/>
     <w:unhideWhenUsed/>
-    <w:rsid w:val="00CC28F3"/>
+    <w:rsid w:val="00C10150"/>
     <w:pPr>
       <w:spacing w:after="100"/>
     </w:pPr>
@@ -30840,7 +30843,7 @@
     <w:autoRedefine/>
     <w:uiPriority w:val="39"/>
     <w:unhideWhenUsed/>
-    <w:rsid w:val="00CC28F3"/>
+    <w:rsid w:val="00C10150"/>
     <w:pPr>
       <w:spacing w:after="100"/>
       <w:ind w:left="220"/>
@@ -30851,7 +30854,7 @@
     <w:basedOn w:val="DefaultParagraphFont"/>
     <w:uiPriority w:val="99"/>
     <w:unhideWhenUsed/>
-    <w:rsid w:val="00CC28F3"/>
+    <w:rsid w:val="00C10150"/>
     <w:rPr>
       <w:color w:val="0000FF" w:themeColor="hyperlink"/>
       <w:u w:val="single"/>

</xml_diff>